<commit_message>
Rapport final : table des matières complète avec numéros de page (42 pages) et version PDF
Co-Authored-By: Claude Opus 5.5 <noreply@anthropic.com>
Claude-Session: https://claude.ai/code/session_01H1sf4zDq3Hzk1M44xBfVAb
</commit_message>
<xml_diff>
--- a/rapport/Rapport_final_Equipe04.docx
+++ b/rapport/Rapport_final_Equipe04.docx
@@ -311,45 +311,1336 @@
         <w:t xml:space="preserve">Table des matières</w:t>
       </w:r>
     </w:p>
-    <w:sdt>
-      <w:sdtPr>
-        <w:alias w:val="Table des matières"/>
-      </w:sdtPr>
-      <w:sdtContent>
-        <w:p>
-          <w:r>
-            <w:fldChar w:fldCharType="begin" w:dirty="true"/>
-            <w:instrText xml:space="preserve">TOC \h \o "1-2"</w:instrText>
-            <w:fldChar w:fldCharType="separate"/>
-          </w:r>
-        </w:p>
-        <w:p>
-          <w:r>
-            <w:fldChar w:fldCharType="end"/>
-          </w:r>
-        </w:p>
-      </w:sdtContent>
-    </w:sdt>
-    <w:p>
-      <w:pPr>
-        <w:spacing w:before="200"/>
-      </w:pPr>
-      <w:r>
-        <w:rPr>
-          <w:i/>
-          <w:iCs/>
-        </w:rPr>
-        <w:t xml:space="preserve">Si la table est vide à l'ouverture, cliquez dessus puis « Mettre à jour la table » (ou F9) dans Word.</w:t>
-      </w:r>
+    <w:p>
+      <w:pPr>
+        <w:tabs>
+          <w:tab w:val="right" w:pos="9360" w:leader="dot"/>
+        </w:tabs>
+        <w:spacing w:after="20" w:before="140"/>
+        <w:ind w:left="0"/>
+      </w:pPr>
+      <w:hyperlink w:history="1" w:anchor="h0">
+        <w:r>
+          <w:rPr>
+            <w:b/>
+            <w:bCs/>
+            <w:sz w:val="22"/>
+            <w:szCs w:val="22"/>
+          </w:rPr>
+          <w:t xml:space="preserve">1. Introduction</w:t>
+        </w:r>
+        <w:r>
+          <w:rPr>
+            <w:b/>
+            <w:bCs/>
+            <w:sz w:val="22"/>
+            <w:szCs w:val="22"/>
+          </w:rPr>
+          <w:tab/>
+          <w:t xml:space="preserve">4</w:t>
+        </w:r>
+      </w:hyperlink>
+    </w:p>
+    <w:p>
+      <w:pPr>
+        <w:tabs>
+          <w:tab w:val="right" w:pos="9360" w:leader="dot"/>
+        </w:tabs>
+        <w:spacing w:after="20" w:before="140"/>
+        <w:ind w:left="0"/>
+      </w:pPr>
+      <w:hyperlink w:history="1" w:anchor="h1">
+        <w:r>
+          <w:rPr>
+            <w:b/>
+            <w:bCs/>
+            <w:sz w:val="22"/>
+            <w:szCs w:val="22"/>
+          </w:rPr>
+          <w:t xml:space="preserve">2. Architecture et plan d'adressage</w:t>
+        </w:r>
+        <w:r>
+          <w:rPr>
+            <w:b/>
+            <w:bCs/>
+            <w:sz w:val="22"/>
+            <w:szCs w:val="22"/>
+          </w:rPr>
+          <w:tab/>
+          <w:t xml:space="preserve">5</w:t>
+        </w:r>
+      </w:hyperlink>
+    </w:p>
+    <w:p>
+      <w:pPr>
+        <w:tabs>
+          <w:tab w:val="right" w:pos="9360" w:leader="dot"/>
+        </w:tabs>
+        <w:spacing w:after="20" w:before="20"/>
+        <w:ind w:left="360"/>
+      </w:pPr>
+      <w:hyperlink w:history="1" w:anchor="h2">
+        <w:r>
+          <w:rPr>
+            <w:b w:val="false"/>
+            <w:bCs w:val="false"/>
+            <w:sz w:val="20"/>
+            <w:szCs w:val="20"/>
+          </w:rPr>
+          <w:t xml:space="preserve">2.1 Serveurs physiques</w:t>
+        </w:r>
+        <w:r>
+          <w:rPr>
+            <w:b w:val="false"/>
+            <w:bCs w:val="false"/>
+            <w:sz w:val="20"/>
+            <w:szCs w:val="20"/>
+          </w:rPr>
+          <w:tab/>
+          <w:t xml:space="preserve">5</w:t>
+        </w:r>
+      </w:hyperlink>
+    </w:p>
+    <w:p>
+      <w:pPr>
+        <w:tabs>
+          <w:tab w:val="right" w:pos="9360" w:leader="dot"/>
+        </w:tabs>
+        <w:spacing w:after="20" w:before="20"/>
+        <w:ind w:left="360"/>
+      </w:pPr>
+      <w:hyperlink w:history="1" w:anchor="h3">
+        <w:r>
+          <w:rPr>
+            <w:b w:val="false"/>
+            <w:bCs w:val="false"/>
+            <w:sz w:val="20"/>
+            <w:szCs w:val="20"/>
+          </w:rPr>
+          <w:t xml:space="preserve">2.2 Réseaux</w:t>
+        </w:r>
+        <w:r>
+          <w:rPr>
+            <w:b w:val="false"/>
+            <w:bCs w:val="false"/>
+            <w:sz w:val="20"/>
+            <w:szCs w:val="20"/>
+          </w:rPr>
+          <w:tab/>
+          <w:t xml:space="preserve">5</w:t>
+        </w:r>
+      </w:hyperlink>
+    </w:p>
+    <w:p>
+      <w:pPr>
+        <w:tabs>
+          <w:tab w:val="right" w:pos="9360" w:leader="dot"/>
+        </w:tabs>
+        <w:spacing w:after="20" w:before="20"/>
+        <w:ind w:left="360"/>
+      </w:pPr>
+      <w:hyperlink w:history="1" w:anchor="h4">
+        <w:r>
+          <w:rPr>
+            <w:b w:val="false"/>
+            <w:bCs w:val="false"/>
+            <w:sz w:val="20"/>
+            <w:szCs w:val="20"/>
+          </w:rPr>
+          <w:t xml:space="preserve">2.3 Machines virtuelles et services</w:t>
+        </w:r>
+        <w:r>
+          <w:rPr>
+            <w:b w:val="false"/>
+            <w:bCs w:val="false"/>
+            <w:sz w:val="20"/>
+            <w:szCs w:val="20"/>
+          </w:rPr>
+          <w:tab/>
+          <w:t xml:space="preserve">5</w:t>
+        </w:r>
+      </w:hyperlink>
+    </w:p>
+    <w:p>
+      <w:pPr>
+        <w:tabs>
+          <w:tab w:val="right" w:pos="9360" w:leader="dot"/>
+        </w:tabs>
+        <w:spacing w:after="20" w:before="140"/>
+        <w:ind w:left="0"/>
+      </w:pPr>
+      <w:hyperlink w:history="1" w:anchor="h5">
+        <w:r>
+          <w:rPr>
+            <w:b/>
+            <w:bCs/>
+            <w:sz w:val="22"/>
+            <w:szCs w:val="22"/>
+          </w:rPr>
+          <w:t xml:space="preserve">3. Démonstration 1 — Virtualisation, sauvegardes et réseau</w:t>
+        </w:r>
+        <w:r>
+          <w:rPr>
+            <w:b/>
+            <w:bCs/>
+            <w:sz w:val="22"/>
+            <w:szCs w:val="22"/>
+          </w:rPr>
+          <w:tab/>
+          <w:t xml:space="preserve">7</w:t>
+        </w:r>
+      </w:hyperlink>
+    </w:p>
+    <w:p>
+      <w:pPr>
+        <w:tabs>
+          <w:tab w:val="right" w:pos="9360" w:leader="dot"/>
+        </w:tabs>
+        <w:spacing w:after="20" w:before="20"/>
+        <w:ind w:left="360"/>
+      </w:pPr>
+      <w:hyperlink w:history="1" w:anchor="h6">
+        <w:r>
+          <w:rPr>
+            <w:b w:val="false"/>
+            <w:bCs w:val="false"/>
+            <w:sz w:val="20"/>
+            <w:szCs w:val="20"/>
+          </w:rPr>
+          <w:t xml:space="preserve">Étape 1 — Inventaire matériel et câblage</w:t>
+        </w:r>
+        <w:r>
+          <w:rPr>
+            <w:b w:val="false"/>
+            <w:bCs w:val="false"/>
+            <w:sz w:val="20"/>
+            <w:szCs w:val="20"/>
+          </w:rPr>
+          <w:tab/>
+          <w:t xml:space="preserve">7</w:t>
+        </w:r>
+      </w:hyperlink>
+    </w:p>
+    <w:p>
+      <w:pPr>
+        <w:tabs>
+          <w:tab w:val="right" w:pos="9360" w:leader="dot"/>
+        </w:tabs>
+        <w:spacing w:after="20" w:before="20"/>
+        <w:ind w:left="360"/>
+      </w:pPr>
+      <w:hyperlink w:history="1" w:anchor="h7">
+        <w:r>
+          <w:rPr>
+            <w:b w:val="false"/>
+            <w:bCs w:val="false"/>
+            <w:sz w:val="20"/>
+            <w:szCs w:val="20"/>
+          </w:rPr>
+          <w:t xml:space="preserve">Étape 2 — Installation de Proxmox VE (VIR-QC-PVE-01)</w:t>
+        </w:r>
+        <w:r>
+          <w:rPr>
+            <w:b w:val="false"/>
+            <w:bCs w:val="false"/>
+            <w:sz w:val="20"/>
+            <w:szCs w:val="20"/>
+          </w:rPr>
+          <w:tab/>
+          <w:t xml:space="preserve">8</w:t>
+        </w:r>
+      </w:hyperlink>
+    </w:p>
+    <w:p>
+      <w:pPr>
+        <w:tabs>
+          <w:tab w:val="right" w:pos="9360" w:leader="dot"/>
+        </w:tabs>
+        <w:spacing w:after="20" w:before="20"/>
+        <w:ind w:left="360"/>
+      </w:pPr>
+      <w:hyperlink w:history="1" w:anchor="h8">
+        <w:r>
+          <w:rPr>
+            <w:b w:val="false"/>
+            <w:bCs w:val="false"/>
+            <w:sz w:val="20"/>
+            <w:szCs w:val="20"/>
+          </w:rPr>
+          <w:t xml:space="preserve">Étape 3 — Proxmox Backup Server (VIR-QC-PBS-01) et console unique</w:t>
+        </w:r>
+        <w:r>
+          <w:rPr>
+            <w:b w:val="false"/>
+            <w:bCs w:val="false"/>
+            <w:sz w:val="20"/>
+            <w:szCs w:val="20"/>
+          </w:rPr>
+          <w:tab/>
+          <w:t xml:space="preserve">9</w:t>
+        </w:r>
+      </w:hyperlink>
+    </w:p>
+    <w:p>
+      <w:pPr>
+        <w:tabs>
+          <w:tab w:val="right" w:pos="9360" w:leader="dot"/>
+        </w:tabs>
+        <w:spacing w:after="20" w:before="20"/>
+        <w:ind w:left="360"/>
+      </w:pPr>
+      <w:hyperlink w:history="1" w:anchor="h9">
+        <w:r>
+          <w:rPr>
+            <w:b w:val="false"/>
+            <w:bCs w:val="false"/>
+            <w:sz w:val="20"/>
+            <w:szCs w:val="20"/>
+          </w:rPr>
+          <w:t xml:space="preserve">Étape 4 — Modèles de machines virtuelles et clones liés</w:t>
+        </w:r>
+        <w:r>
+          <w:rPr>
+            <w:b w:val="false"/>
+            <w:bCs w:val="false"/>
+            <w:sz w:val="20"/>
+            <w:szCs w:val="20"/>
+          </w:rPr>
+          <w:tab/>
+          <w:t xml:space="preserve">11</w:t>
+        </w:r>
+      </w:hyperlink>
+    </w:p>
+    <w:p>
+      <w:pPr>
+        <w:tabs>
+          <w:tab w:val="right" w:pos="9360" w:leader="dot"/>
+        </w:tabs>
+        <w:spacing w:after="20" w:before="20"/>
+        <w:ind w:left="360"/>
+      </w:pPr>
+      <w:hyperlink w:history="1" w:anchor="h10">
+        <w:r>
+          <w:rPr>
+            <w:b w:val="false"/>
+            <w:bCs w:val="false"/>
+            <w:sz w:val="20"/>
+            <w:szCs w:val="20"/>
+          </w:rPr>
+          <w:t xml:space="preserve">Étape 5 — Script de création de machine virtuelle</w:t>
+        </w:r>
+        <w:r>
+          <w:rPr>
+            <w:b w:val="false"/>
+            <w:bCs w:val="false"/>
+            <w:sz w:val="20"/>
+            <w:szCs w:val="20"/>
+          </w:rPr>
+          <w:tab/>
+          <w:t xml:space="preserve">11</w:t>
+        </w:r>
+      </w:hyperlink>
+    </w:p>
+    <w:p>
+      <w:pPr>
+        <w:tabs>
+          <w:tab w:val="right" w:pos="9360" w:leader="dot"/>
+        </w:tabs>
+        <w:spacing w:after="20" w:before="20"/>
+        <w:ind w:left="360"/>
+      </w:pPr>
+      <w:hyperlink w:history="1" w:anchor="h11">
+        <w:r>
+          <w:rPr>
+            <w:b w:val="false"/>
+            <w:bCs w:val="false"/>
+            <w:sz w:val="20"/>
+            <w:szCs w:val="20"/>
+          </w:rPr>
+          <w:t xml:space="preserve">Étape 6 — Sauvegardes planifiées</w:t>
+        </w:r>
+        <w:r>
+          <w:rPr>
+            <w:b w:val="false"/>
+            <w:bCs w:val="false"/>
+            <w:sz w:val="20"/>
+            <w:szCs w:val="20"/>
+          </w:rPr>
+          <w:tab/>
+          <w:t xml:space="preserve">12</w:t>
+        </w:r>
+      </w:hyperlink>
+    </w:p>
+    <w:p>
+      <w:pPr>
+        <w:tabs>
+          <w:tab w:val="right" w:pos="9360" w:leader="dot"/>
+        </w:tabs>
+        <w:spacing w:after="20" w:before="20"/>
+        <w:ind w:left="360"/>
+      </w:pPr>
+      <w:hyperlink w:history="1" w:anchor="h12">
+        <w:r>
+          <w:rPr>
+            <w:b w:val="false"/>
+            <w:bCs w:val="false"/>
+            <w:sz w:val="20"/>
+            <w:szCs w:val="20"/>
+          </w:rPr>
+          <w:t xml:space="preserve">Étape 7 — pfSense : routeur et pare-feu (VIR-QC-FW-01)</w:t>
+        </w:r>
+        <w:r>
+          <w:rPr>
+            <w:b w:val="false"/>
+            <w:bCs w:val="false"/>
+            <w:sz w:val="20"/>
+            <w:szCs w:val="20"/>
+          </w:rPr>
+          <w:tab/>
+          <w:t xml:space="preserve">14</w:t>
+        </w:r>
+      </w:hyperlink>
+    </w:p>
+    <w:p>
+      <w:pPr>
+        <w:tabs>
+          <w:tab w:val="right" w:pos="9360" w:leader="dot"/>
+        </w:tabs>
+        <w:spacing w:after="20" w:before="20"/>
+        <w:ind w:left="360"/>
+      </w:pPr>
+      <w:hyperlink w:history="1" w:anchor="h13">
+        <w:r>
+          <w:rPr>
+            <w:b w:val="false"/>
+            <w:bCs w:val="false"/>
+            <w:sz w:val="20"/>
+            <w:szCs w:val="20"/>
+          </w:rPr>
+          <w:t xml:space="preserve">Étape 8 — Service DHCP</w:t>
+        </w:r>
+        <w:r>
+          <w:rPr>
+            <w:b w:val="false"/>
+            <w:bCs w:val="false"/>
+            <w:sz w:val="20"/>
+            <w:szCs w:val="20"/>
+          </w:rPr>
+          <w:tab/>
+          <w:t xml:space="preserve">15</w:t>
+        </w:r>
+      </w:hyperlink>
+    </w:p>
+    <w:p>
+      <w:pPr>
+        <w:tabs>
+          <w:tab w:val="right" w:pos="9360" w:leader="dot"/>
+        </w:tabs>
+        <w:spacing w:after="20" w:before="20"/>
+        <w:ind w:left="360"/>
+      </w:pPr>
+      <w:hyperlink w:history="1" w:anchor="h14">
+        <w:r>
+          <w:rPr>
+            <w:b w:val="false"/>
+            <w:bCs w:val="false"/>
+            <w:sz w:val="20"/>
+            <w:szCs w:val="20"/>
+          </w:rPr>
+          <w:t xml:space="preserve">Étape 9 — VPN entre le siège et les succursales</w:t>
+        </w:r>
+        <w:r>
+          <w:rPr>
+            <w:b w:val="false"/>
+            <w:bCs w:val="false"/>
+            <w:sz w:val="20"/>
+            <w:szCs w:val="20"/>
+          </w:rPr>
+          <w:tab/>
+          <w:t xml:space="preserve">16</w:t>
+        </w:r>
+      </w:hyperlink>
+    </w:p>
+    <w:p>
+      <w:pPr>
+        <w:tabs>
+          <w:tab w:val="right" w:pos="9360" w:leader="dot"/>
+        </w:tabs>
+        <w:spacing w:after="20" w:before="140"/>
+        <w:ind w:left="0"/>
+      </w:pPr>
+      <w:hyperlink w:history="1" w:anchor="h15">
+        <w:r>
+          <w:rPr>
+            <w:b/>
+            <w:bCs/>
+            <w:sz w:val="22"/>
+            <w:szCs w:val="22"/>
+          </w:rPr>
+          <w:t xml:space="preserve">4. Démonstration 2 — Active Directory, GPO, partages et DNS</w:t>
+        </w:r>
+        <w:r>
+          <w:rPr>
+            <w:b/>
+            <w:bCs/>
+            <w:sz w:val="22"/>
+            <w:szCs w:val="22"/>
+          </w:rPr>
+          <w:tab/>
+          <w:t xml:space="preserve">18</w:t>
+        </w:r>
+      </w:hyperlink>
+    </w:p>
+    <w:p>
+      <w:pPr>
+        <w:tabs>
+          <w:tab w:val="right" w:pos="9360" w:leader="dot"/>
+        </w:tabs>
+        <w:spacing w:after="20" w:before="20"/>
+        <w:ind w:left="360"/>
+      </w:pPr>
+      <w:hyperlink w:history="1" w:anchor="h16">
+        <w:r>
+          <w:rPr>
+            <w:b w:val="false"/>
+            <w:bCs w:val="false"/>
+            <w:sz w:val="20"/>
+            <w:szCs w:val="20"/>
+          </w:rPr>
+          <w:t xml:space="preserve">Étape 10 — Contrôleur de domaine principal (VIR-QC-DC-01)</w:t>
+        </w:r>
+        <w:r>
+          <w:rPr>
+            <w:b w:val="false"/>
+            <w:bCs w:val="false"/>
+            <w:sz w:val="20"/>
+            <w:szCs w:val="20"/>
+          </w:rPr>
+          <w:tab/>
+          <w:t xml:space="preserve">18</w:t>
+        </w:r>
+      </w:hyperlink>
+    </w:p>
+    <w:p>
+      <w:pPr>
+        <w:tabs>
+          <w:tab w:val="right" w:pos="9360" w:leader="dot"/>
+        </w:tabs>
+        <w:spacing w:after="20" w:before="20"/>
+        <w:ind w:left="360"/>
+      </w:pPr>
+      <w:hyperlink w:history="1" w:anchor="h17">
+        <w:r>
+          <w:rPr>
+            <w:b w:val="false"/>
+            <w:bCs w:val="false"/>
+            <w:sz w:val="20"/>
+            <w:szCs w:val="20"/>
+          </w:rPr>
+          <w:t xml:space="preserve">Étape 11 — Contrôleurs en lecture seule des succursales (RODC)</w:t>
+        </w:r>
+        <w:r>
+          <w:rPr>
+            <w:b w:val="false"/>
+            <w:bCs w:val="false"/>
+            <w:sz w:val="20"/>
+            <w:szCs w:val="20"/>
+          </w:rPr>
+          <w:tab/>
+          <w:t xml:space="preserve">18</w:t>
+        </w:r>
+      </w:hyperlink>
+    </w:p>
+    <w:p>
+      <w:pPr>
+        <w:tabs>
+          <w:tab w:val="right" w:pos="9360" w:leader="dot"/>
+        </w:tabs>
+        <w:spacing w:after="20" w:before="20"/>
+        <w:ind w:left="360"/>
+      </w:pPr>
+      <w:hyperlink w:history="1" w:anchor="h18">
+        <w:r>
+          <w:rPr>
+            <w:b w:val="false"/>
+            <w:bCs w:val="false"/>
+            <w:sz w:val="20"/>
+            <w:szCs w:val="20"/>
+          </w:rPr>
+          <w:t xml:space="preserve">Étape 12 — Création des utilisateurs et des groupes</w:t>
+        </w:r>
+        <w:r>
+          <w:rPr>
+            <w:b w:val="false"/>
+            <w:bCs w:val="false"/>
+            <w:sz w:val="20"/>
+            <w:szCs w:val="20"/>
+          </w:rPr>
+          <w:tab/>
+          <w:t xml:space="preserve">20</w:t>
+        </w:r>
+      </w:hyperlink>
+    </w:p>
+    <w:p>
+      <w:pPr>
+        <w:tabs>
+          <w:tab w:val="right" w:pos="9360" w:leader="dot"/>
+        </w:tabs>
+        <w:spacing w:after="20" w:before="20"/>
+        <w:ind w:left="360"/>
+      </w:pPr>
+      <w:hyperlink w:history="1" w:anchor="h19">
+        <w:r>
+          <w:rPr>
+            <w:b w:val="false"/>
+            <w:bCs w:val="false"/>
+            <w:sz w:val="20"/>
+            <w:szCs w:val="20"/>
+          </w:rPr>
+          <w:t xml:space="preserve">Étape 13 — Stratégies de groupe (GPO)</w:t>
+        </w:r>
+        <w:r>
+          <w:rPr>
+            <w:b w:val="false"/>
+            <w:bCs w:val="false"/>
+            <w:sz w:val="20"/>
+            <w:szCs w:val="20"/>
+          </w:rPr>
+          <w:tab/>
+          <w:t xml:space="preserve">21</w:t>
+        </w:r>
+      </w:hyperlink>
+    </w:p>
+    <w:p>
+      <w:pPr>
+        <w:tabs>
+          <w:tab w:val="right" w:pos="9360" w:leader="dot"/>
+        </w:tabs>
+        <w:spacing w:after="20" w:before="20"/>
+        <w:ind w:left="360"/>
+      </w:pPr>
+      <w:hyperlink w:history="1" w:anchor="h20">
+        <w:r>
+          <w:rPr>
+            <w:b w:val="false"/>
+            <w:bCs w:val="false"/>
+            <w:sz w:val="20"/>
+            <w:szCs w:val="20"/>
+          </w:rPr>
+          <w:t xml:space="preserve">Étape 14 — Partages et lecteurs réseau</w:t>
+        </w:r>
+        <w:r>
+          <w:rPr>
+            <w:b w:val="false"/>
+            <w:bCs w:val="false"/>
+            <w:sz w:val="20"/>
+            <w:szCs w:val="20"/>
+          </w:rPr>
+          <w:tab/>
+          <w:t xml:space="preserve">22</w:t>
+        </w:r>
+      </w:hyperlink>
+    </w:p>
+    <w:p>
+      <w:pPr>
+        <w:tabs>
+          <w:tab w:val="right" w:pos="9360" w:leader="dot"/>
+        </w:tabs>
+        <w:spacing w:after="20" w:before="20"/>
+        <w:ind w:left="360"/>
+      </w:pPr>
+      <w:hyperlink w:history="1" w:anchor="h21">
+        <w:r>
+          <w:rPr>
+            <w:b w:val="false"/>
+            <w:bCs w:val="false"/>
+            <w:sz w:val="20"/>
+            <w:szCs w:val="20"/>
+          </w:rPr>
+          <w:t xml:space="preserve">Étape 15 — Service DNS principal et secondaire</w:t>
+        </w:r>
+        <w:r>
+          <w:rPr>
+            <w:b w:val="false"/>
+            <w:bCs w:val="false"/>
+            <w:sz w:val="20"/>
+            <w:szCs w:val="20"/>
+          </w:rPr>
+          <w:tab/>
+          <w:t xml:space="preserve">24</w:t>
+        </w:r>
+      </w:hyperlink>
+    </w:p>
+    <w:p>
+      <w:pPr>
+        <w:tabs>
+          <w:tab w:val="right" w:pos="9360" w:leader="dot"/>
+        </w:tabs>
+        <w:spacing w:after="20" w:before="20"/>
+        <w:ind w:left="360"/>
+      </w:pPr>
+      <w:hyperlink w:history="1" w:anchor="h22">
+        <w:r>
+          <w:rPr>
+            <w:b w:val="false"/>
+            <w:bCs w:val="false"/>
+            <w:sz w:val="20"/>
+            <w:szCs w:val="20"/>
+          </w:rPr>
+          <w:t xml:space="preserve">Étape 16 — Poste de travail Windows 11 (VIR-QC-WS-01)</w:t>
+        </w:r>
+        <w:r>
+          <w:rPr>
+            <w:b w:val="false"/>
+            <w:bCs w:val="false"/>
+            <w:sz w:val="20"/>
+            <w:szCs w:val="20"/>
+          </w:rPr>
+          <w:tab/>
+          <w:t xml:space="preserve">25</w:t>
+        </w:r>
+      </w:hyperlink>
+    </w:p>
+    <w:p>
+      <w:pPr>
+        <w:tabs>
+          <w:tab w:val="right" w:pos="9360" w:leader="dot"/>
+        </w:tabs>
+        <w:spacing w:after="20" w:before="140"/>
+        <w:ind w:left="0"/>
+      </w:pPr>
+      <w:hyperlink w:history="1" w:anchor="h23">
+        <w:r>
+          <w:rPr>
+            <w:b/>
+            <w:bCs/>
+            <w:sz w:val="22"/>
+            <w:szCs w:val="22"/>
+          </w:rPr>
+          <w:t xml:space="preserve">5. Démonstration 3 — Stockage TrueNAS</w:t>
+        </w:r>
+        <w:r>
+          <w:rPr>
+            <w:b/>
+            <w:bCs/>
+            <w:sz w:val="22"/>
+            <w:szCs w:val="22"/>
+          </w:rPr>
+          <w:tab/>
+          <w:t xml:space="preserve">28</w:t>
+        </w:r>
+      </w:hyperlink>
+    </w:p>
+    <w:p>
+      <w:pPr>
+        <w:tabs>
+          <w:tab w:val="right" w:pos="9360" w:leader="dot"/>
+        </w:tabs>
+        <w:spacing w:after="20" w:before="20"/>
+        <w:ind w:left="360"/>
+      </w:pPr>
+      <w:hyperlink w:history="1" w:anchor="h24">
+        <w:r>
+          <w:rPr>
+            <w:b w:val="false"/>
+            <w:bCs w:val="false"/>
+            <w:sz w:val="20"/>
+            <w:szCs w:val="20"/>
+          </w:rPr>
+          <w:t xml:space="preserve">Étape 17 — Installation de TrueNAS (VIR-QC-NAS-01)</w:t>
+        </w:r>
+        <w:r>
+          <w:rPr>
+            <w:b w:val="false"/>
+            <w:bCs w:val="false"/>
+            <w:sz w:val="20"/>
+            <w:szCs w:val="20"/>
+          </w:rPr>
+          <w:tab/>
+          <w:t xml:space="preserve">28</w:t>
+        </w:r>
+      </w:hyperlink>
+    </w:p>
+    <w:p>
+      <w:pPr>
+        <w:tabs>
+          <w:tab w:val="right" w:pos="9360" w:leader="dot"/>
+        </w:tabs>
+        <w:spacing w:after="20" w:before="20"/>
+        <w:ind w:left="360"/>
+      </w:pPr>
+      <w:hyperlink w:history="1" w:anchor="h25">
+        <w:r>
+          <w:rPr>
+            <w:b w:val="false"/>
+            <w:bCs w:val="false"/>
+            <w:sz w:val="20"/>
+            <w:szCs w:val="20"/>
+          </w:rPr>
+          <w:t xml:space="preserve">Étape 18 — Volumes redondants : RAID 1, RAID 5 et LVM</w:t>
+        </w:r>
+        <w:r>
+          <w:rPr>
+            <w:b w:val="false"/>
+            <w:bCs w:val="false"/>
+            <w:sz w:val="20"/>
+            <w:szCs w:val="20"/>
+          </w:rPr>
+          <w:tab/>
+          <w:t xml:space="preserve">28</w:t>
+        </w:r>
+      </w:hyperlink>
+    </w:p>
+    <w:p>
+      <w:pPr>
+        <w:tabs>
+          <w:tab w:val="right" w:pos="9360" w:leader="dot"/>
+        </w:tabs>
+        <w:spacing w:after="20" w:before="20"/>
+        <w:ind w:left="360"/>
+      </w:pPr>
+      <w:hyperlink w:history="1" w:anchor="h26">
+        <w:r>
+          <w:rPr>
+            <w:b w:val="false"/>
+            <w:bCs w:val="false"/>
+            <w:sz w:val="20"/>
+            <w:szCs w:val="20"/>
+          </w:rPr>
+          <w:t xml:space="preserve">Étape 19 — Partages NFS et SMB2</w:t>
+        </w:r>
+        <w:r>
+          <w:rPr>
+            <w:b w:val="false"/>
+            <w:bCs w:val="false"/>
+            <w:sz w:val="20"/>
+            <w:szCs w:val="20"/>
+          </w:rPr>
+          <w:tab/>
+          <w:t xml:space="preserve">29</w:t>
+        </w:r>
+      </w:hyperlink>
+    </w:p>
+    <w:p>
+      <w:pPr>
+        <w:tabs>
+          <w:tab w:val="right" w:pos="9360" w:leader="dot"/>
+        </w:tabs>
+        <w:spacing w:after="20" w:before="140"/>
+        <w:ind w:left="0"/>
+      </w:pPr>
+      <w:hyperlink w:history="1" w:anchor="h27">
+        <w:r>
+          <w:rPr>
+            <w:b/>
+            <w:bCs/>
+            <w:sz w:val="22"/>
+            <w:szCs w:val="22"/>
+          </w:rPr>
+          <w:t xml:space="preserve">6. Démonstration 4 — NextCloud et supervision</w:t>
+        </w:r>
+        <w:r>
+          <w:rPr>
+            <w:b/>
+            <w:bCs/>
+            <w:sz w:val="22"/>
+            <w:szCs w:val="22"/>
+          </w:rPr>
+          <w:tab/>
+          <w:t xml:space="preserve">31</w:t>
+        </w:r>
+      </w:hyperlink>
+    </w:p>
+    <w:p>
+      <w:pPr>
+        <w:tabs>
+          <w:tab w:val="right" w:pos="9360" w:leader="dot"/>
+        </w:tabs>
+        <w:spacing w:after="20" w:before="20"/>
+        <w:ind w:left="360"/>
+      </w:pPr>
+      <w:hyperlink w:history="1" w:anchor="h28">
+        <w:r>
+          <w:rPr>
+            <w:b w:val="false"/>
+            <w:bCs w:val="false"/>
+            <w:sz w:val="20"/>
+            <w:szCs w:val="20"/>
+          </w:rPr>
+          <w:t xml:space="preserve">Étape 20 — NextCloud en conteneur (VIR-QC-NC-01)</w:t>
+        </w:r>
+        <w:r>
+          <w:rPr>
+            <w:b w:val="false"/>
+            <w:bCs w:val="false"/>
+            <w:sz w:val="20"/>
+            <w:szCs w:val="20"/>
+          </w:rPr>
+          <w:tab/>
+          <w:t xml:space="preserve">31</w:t>
+        </w:r>
+      </w:hyperlink>
+    </w:p>
+    <w:p>
+      <w:pPr>
+        <w:tabs>
+          <w:tab w:val="right" w:pos="9360" w:leader="dot"/>
+        </w:tabs>
+        <w:spacing w:after="20" w:before="20"/>
+        <w:ind w:left="360"/>
+      </w:pPr>
+      <w:hyperlink w:history="1" w:anchor="h29">
+        <w:r>
+          <w:rPr>
+            <w:b w:val="false"/>
+            <w:bCs w:val="false"/>
+            <w:sz w:val="20"/>
+            <w:szCs w:val="20"/>
+          </w:rPr>
+          <w:t xml:space="preserve">Étape 21 — Service de supervision (VIR-QC-MON-01)</w:t>
+        </w:r>
+        <w:r>
+          <w:rPr>
+            <w:b w:val="false"/>
+            <w:bCs w:val="false"/>
+            <w:sz w:val="20"/>
+            <w:szCs w:val="20"/>
+          </w:rPr>
+          <w:tab/>
+          <w:t xml:space="preserve">32</w:t>
+        </w:r>
+      </w:hyperlink>
+    </w:p>
+    <w:p>
+      <w:pPr>
+        <w:tabs>
+          <w:tab w:val="right" w:pos="9360" w:leader="dot"/>
+        </w:tabs>
+        <w:spacing w:after="20" w:before="20"/>
+        <w:ind w:left="360"/>
+      </w:pPr>
+      <w:hyperlink w:history="1" w:anchor="h30">
+        <w:r>
+          <w:rPr>
+            <w:b w:val="false"/>
+            <w:bCs w:val="false"/>
+            <w:sz w:val="20"/>
+            <w:szCs w:val="20"/>
+          </w:rPr>
+          <w:t xml:space="preserve">Étape 22 — Gestion des conteneurs avec Dockhand</w:t>
+        </w:r>
+        <w:r>
+          <w:rPr>
+            <w:b w:val="false"/>
+            <w:bCs w:val="false"/>
+            <w:sz w:val="20"/>
+            <w:szCs w:val="20"/>
+          </w:rPr>
+          <w:tab/>
+          <w:t xml:space="preserve">33</w:t>
+        </w:r>
+      </w:hyperlink>
+    </w:p>
+    <w:p>
+      <w:pPr>
+        <w:tabs>
+          <w:tab w:val="right" w:pos="9360" w:leader="dot"/>
+        </w:tabs>
+        <w:spacing w:after="20" w:before="140"/>
+        <w:ind w:left="0"/>
+      </w:pPr>
+      <w:hyperlink w:history="1" w:anchor="h31">
+        <w:r>
+          <w:rPr>
+            <w:b/>
+            <w:bCs/>
+            <w:sz w:val="22"/>
+            <w:szCs w:val="22"/>
+          </w:rPr>
+          <w:t xml:space="preserve">7. Démonstration 5 — Site Web, supervision et pare-feux</w:t>
+        </w:r>
+        <w:r>
+          <w:rPr>
+            <w:b/>
+            <w:bCs/>
+            <w:sz w:val="22"/>
+            <w:szCs w:val="22"/>
+          </w:rPr>
+          <w:tab/>
+          <w:t xml:space="preserve">34</w:t>
+        </w:r>
+      </w:hyperlink>
+    </w:p>
+    <w:p>
+      <w:pPr>
+        <w:tabs>
+          <w:tab w:val="right" w:pos="9360" w:leader="dot"/>
+        </w:tabs>
+        <w:spacing w:after="20" w:before="20"/>
+        <w:ind w:left="360"/>
+      </w:pPr>
+      <w:hyperlink w:history="1" w:anchor="h32">
+        <w:r>
+          <w:rPr>
+            <w:b w:val="false"/>
+            <w:bCs w:val="false"/>
+            <w:sz w:val="20"/>
+            <w:szCs w:val="20"/>
+          </w:rPr>
+          <w:t xml:space="preserve">Étape 23 — Site Web sécurisé HTTPS (VIR-QC-WEB-01)</w:t>
+        </w:r>
+        <w:r>
+          <w:rPr>
+            <w:b w:val="false"/>
+            <w:bCs w:val="false"/>
+            <w:sz w:val="20"/>
+            <w:szCs w:val="20"/>
+          </w:rPr>
+          <w:tab/>
+          <w:t xml:space="preserve">34</w:t>
+        </w:r>
+      </w:hyperlink>
+    </w:p>
+    <w:p>
+      <w:pPr>
+        <w:tabs>
+          <w:tab w:val="right" w:pos="9360" w:leader="dot"/>
+        </w:tabs>
+        <w:spacing w:after="20" w:before="20"/>
+        <w:ind w:left="360"/>
+      </w:pPr>
+      <w:hyperlink w:history="1" w:anchor="h33">
+        <w:r>
+          <w:rPr>
+            <w:b w:val="false"/>
+            <w:bCs w:val="false"/>
+            <w:sz w:val="20"/>
+            <w:szCs w:val="20"/>
+          </w:rPr>
+          <w:t xml:space="preserve">Étape 24 — Supervision d'un serveur Windows et d'un serveur Linux</w:t>
+        </w:r>
+        <w:r>
+          <w:rPr>
+            <w:b w:val="false"/>
+            <w:bCs w:val="false"/>
+            <w:sz w:val="20"/>
+            <w:szCs w:val="20"/>
+          </w:rPr>
+          <w:tab/>
+          <w:t xml:space="preserve">35</w:t>
+        </w:r>
+      </w:hyperlink>
+    </w:p>
+    <w:p>
+      <w:pPr>
+        <w:tabs>
+          <w:tab w:val="right" w:pos="9360" w:leader="dot"/>
+        </w:tabs>
+        <w:spacing w:after="20" w:before="20"/>
+        <w:ind w:left="360"/>
+      </w:pPr>
+      <w:hyperlink w:history="1" w:anchor="h34">
+        <w:r>
+          <w:rPr>
+            <w:b w:val="false"/>
+            <w:bCs w:val="false"/>
+            <w:sz w:val="20"/>
+            <w:szCs w:val="20"/>
+          </w:rPr>
+          <w:t xml:space="preserve">Étape 25 — Pare-feux d'hôtes</w:t>
+        </w:r>
+        <w:r>
+          <w:rPr>
+            <w:b w:val="false"/>
+            <w:bCs w:val="false"/>
+            <w:sz w:val="20"/>
+            <w:szCs w:val="20"/>
+          </w:rPr>
+          <w:tab/>
+          <w:t xml:space="preserve">36</w:t>
+        </w:r>
+      </w:hyperlink>
+    </w:p>
+    <w:p>
+      <w:pPr>
+        <w:tabs>
+          <w:tab w:val="right" w:pos="9360" w:leader="dot"/>
+        </w:tabs>
+        <w:spacing w:after="20" w:before="20"/>
+        <w:ind w:left="360"/>
+      </w:pPr>
+      <w:hyperlink w:history="1" w:anchor="h35">
+        <w:r>
+          <w:rPr>
+            <w:b w:val="false"/>
+            <w:bCs w:val="false"/>
+            <w:sz w:val="20"/>
+            <w:szCs w:val="20"/>
+          </w:rPr>
+          <w:t xml:space="preserve">Étape 26 — Automatisation avec Ansible (VIR-QC-ANS-01)</w:t>
+        </w:r>
+        <w:r>
+          <w:rPr>
+            <w:b w:val="false"/>
+            <w:bCs w:val="false"/>
+            <w:sz w:val="20"/>
+            <w:szCs w:val="20"/>
+          </w:rPr>
+          <w:tab/>
+          <w:t xml:space="preserve">37</w:t>
+        </w:r>
+      </w:hyperlink>
+    </w:p>
+    <w:p>
+      <w:pPr>
+        <w:tabs>
+          <w:tab w:val="right" w:pos="9360" w:leader="dot"/>
+        </w:tabs>
+        <w:spacing w:after="20" w:before="140"/>
+        <w:ind w:left="0"/>
+      </w:pPr>
+      <w:hyperlink w:history="1" w:anchor="h36">
+        <w:r>
+          <w:rPr>
+            <w:b/>
+            <w:bCs/>
+            <w:sz w:val="22"/>
+            <w:szCs w:val="22"/>
+          </w:rPr>
+          <w:t xml:space="preserve">8. Synthèse de la sécurité de l'infrastructure</w:t>
+        </w:r>
+        <w:r>
+          <w:rPr>
+            <w:b/>
+            <w:bCs/>
+            <w:sz w:val="22"/>
+            <w:szCs w:val="22"/>
+          </w:rPr>
+          <w:tab/>
+          <w:t xml:space="preserve">39</w:t>
+        </w:r>
+      </w:hyperlink>
+    </w:p>
+    <w:p>
+      <w:pPr>
+        <w:tabs>
+          <w:tab w:val="right" w:pos="9360" w:leader="dot"/>
+        </w:tabs>
+        <w:spacing w:after="20" w:before="140"/>
+        <w:ind w:left="0"/>
+      </w:pPr>
+      <w:hyperlink w:history="1" w:anchor="h37">
+        <w:r>
+          <w:rPr>
+            <w:b/>
+            <w:bCs/>
+            <w:sz w:val="22"/>
+            <w:szCs w:val="22"/>
+          </w:rPr>
+          <w:t xml:space="preserve">9. Conclusions</w:t>
+        </w:r>
+        <w:r>
+          <w:rPr>
+            <w:b/>
+            <w:bCs/>
+            <w:sz w:val="22"/>
+            <w:szCs w:val="22"/>
+          </w:rPr>
+          <w:tab/>
+          <w:t xml:space="preserve">40</w:t>
+        </w:r>
+      </w:hyperlink>
+    </w:p>
+    <w:p>
+      <w:pPr>
+        <w:tabs>
+          <w:tab w:val="right" w:pos="9360" w:leader="dot"/>
+        </w:tabs>
+        <w:spacing w:after="20" w:before="20"/>
+        <w:ind w:left="360"/>
+      </w:pPr>
+      <w:hyperlink w:history="1" w:anchor="h38">
+        <w:r>
+          <w:rPr>
+            <w:b w:val="false"/>
+            <w:bCs w:val="false"/>
+            <w:sz w:val="20"/>
+            <w:szCs w:val="20"/>
+          </w:rPr>
+          <w:t xml:space="preserve">Conclusion de [Nom 1]</w:t>
+        </w:r>
+        <w:r>
+          <w:rPr>
+            <w:b w:val="false"/>
+            <w:bCs w:val="false"/>
+            <w:sz w:val="20"/>
+            <w:szCs w:val="20"/>
+          </w:rPr>
+          <w:tab/>
+          <w:t xml:space="preserve">40</w:t>
+        </w:r>
+      </w:hyperlink>
+    </w:p>
+    <w:p>
+      <w:pPr>
+        <w:tabs>
+          <w:tab w:val="right" w:pos="9360" w:leader="dot"/>
+        </w:tabs>
+        <w:spacing w:after="20" w:before="20"/>
+        <w:ind w:left="360"/>
+      </w:pPr>
+      <w:hyperlink w:history="1" w:anchor="h39">
+        <w:r>
+          <w:rPr>
+            <w:b w:val="false"/>
+            <w:bCs w:val="false"/>
+            <w:sz w:val="20"/>
+            <w:szCs w:val="20"/>
+          </w:rPr>
+          <w:t xml:space="preserve">Conclusion de [Nom 2]</w:t>
+        </w:r>
+        <w:r>
+          <w:rPr>
+            <w:b w:val="false"/>
+            <w:bCs w:val="false"/>
+            <w:sz w:val="20"/>
+            <w:szCs w:val="20"/>
+          </w:rPr>
+          <w:tab/>
+          <w:t xml:space="preserve">40</w:t>
+        </w:r>
+      </w:hyperlink>
+    </w:p>
+    <w:p>
+      <w:pPr>
+        <w:tabs>
+          <w:tab w:val="right" w:pos="9360" w:leader="dot"/>
+        </w:tabs>
+        <w:spacing w:after="20" w:before="20"/>
+        <w:ind w:left="360"/>
+      </w:pPr>
+      <w:hyperlink w:history="1" w:anchor="h40">
+        <w:r>
+          <w:rPr>
+            <w:b w:val="false"/>
+            <w:bCs w:val="false"/>
+            <w:sz w:val="20"/>
+            <w:szCs w:val="20"/>
+          </w:rPr>
+          <w:t xml:space="preserve">Conclusion de [Nom 3]</w:t>
+        </w:r>
+        <w:r>
+          <w:rPr>
+            <w:b w:val="false"/>
+            <w:bCs w:val="false"/>
+            <w:sz w:val="20"/>
+            <w:szCs w:val="20"/>
+          </w:rPr>
+          <w:tab/>
+          <w:t xml:space="preserve">40</w:t>
+        </w:r>
+      </w:hyperlink>
+    </w:p>
+    <w:p>
+      <w:pPr>
+        <w:tabs>
+          <w:tab w:val="right" w:pos="9360" w:leader="dot"/>
+        </w:tabs>
+        <w:spacing w:after="20" w:before="20"/>
+        <w:ind w:left="360"/>
+      </w:pPr>
+      <w:hyperlink w:history="1" w:anchor="h41">
+        <w:r>
+          <w:rPr>
+            <w:b w:val="false"/>
+            <w:bCs w:val="false"/>
+            <w:sz w:val="20"/>
+            <w:szCs w:val="20"/>
+          </w:rPr>
+          <w:t xml:space="preserve">Conclusion de [Nom 4]</w:t>
+        </w:r>
+        <w:r>
+          <w:rPr>
+            <w:b w:val="false"/>
+            <w:bCs w:val="false"/>
+            <w:sz w:val="20"/>
+            <w:szCs w:val="20"/>
+          </w:rPr>
+          <w:tab/>
+          <w:t xml:space="preserve">40</w:t>
+        </w:r>
+      </w:hyperlink>
+    </w:p>
+    <w:p>
+      <w:pPr>
+        <w:tabs>
+          <w:tab w:val="right" w:pos="9360" w:leader="dot"/>
+        </w:tabs>
+        <w:spacing w:after="20" w:before="140"/>
+        <w:ind w:left="0"/>
+      </w:pPr>
+      <w:hyperlink w:history="1" w:anchor="h42">
+        <w:r>
+          <w:rPr>
+            <w:b/>
+            <w:bCs/>
+            <w:sz w:val="22"/>
+            <w:szCs w:val="22"/>
+          </w:rPr>
+          <w:t xml:space="preserve">10. Webographie</w:t>
+        </w:r>
+        <w:r>
+          <w:rPr>
+            <w:b/>
+            <w:bCs/>
+            <w:sz w:val="22"/>
+            <w:szCs w:val="22"/>
+          </w:rPr>
+          <w:tab/>
+          <w:t xml:space="preserve">41</w:t>
+        </w:r>
+      </w:hyperlink>
+    </w:p>
+    <w:p>
+      <w:pPr>
+        <w:tabs>
+          <w:tab w:val="right" w:pos="9360" w:leader="dot"/>
+        </w:tabs>
+        <w:spacing w:after="20" w:before="140"/>
+        <w:ind w:left="0"/>
+      </w:pPr>
+      <w:hyperlink w:history="1" w:anchor="h43">
+        <w:r>
+          <w:rPr>
+            <w:b/>
+            <w:bCs/>
+            <w:sz w:val="22"/>
+            <w:szCs w:val="22"/>
+          </w:rPr>
+          <w:t xml:space="preserve">11. Annexe — Scripts utilisés</w:t>
+        </w:r>
+        <w:r>
+          <w:rPr>
+            <w:b/>
+            <w:bCs/>
+            <w:sz w:val="22"/>
+            <w:szCs w:val="22"/>
+          </w:rPr>
+          <w:tab/>
+          <w:t xml:space="preserve">42</w:t>
+        </w:r>
+      </w:hyperlink>
     </w:p>
     <w:p>
       <w:pPr>
         <w:pStyle w:val="Heading1"/>
         <w:pageBreakBefore/>
       </w:pPr>
+      <w:bookmarkStart w:name="h0" w:id="1"/>
       <w:r>
         <w:t xml:space="preserve">1. Introduction</w:t>
       </w:r>
+      <w:bookmarkEnd w:id="1"/>
     </w:p>
     <w:p>
       <w:pPr>
@@ -404,17 +1695,21 @@
         <w:pStyle w:val="Heading1"/>
         <w:pageBreakBefore/>
       </w:pPr>
+      <w:bookmarkStart w:name="h1" w:id="2"/>
       <w:r>
         <w:t xml:space="preserve">2. Architecture et plan d'adressage</w:t>
       </w:r>
+      <w:bookmarkEnd w:id="2"/>
     </w:p>
     <w:p>
       <w:pPr>
         <w:pStyle w:val="Heading2"/>
       </w:pPr>
+      <w:bookmarkStart w:name="h2" w:id="3"/>
       <w:r>
         <w:t xml:space="preserve">2.1 Serveurs physiques</w:t>
       </w:r>
+      <w:bookmarkEnd w:id="3"/>
     </w:p>
     <w:tbl>
       <w:tblPr>
@@ -730,9 +2025,11 @@
       <w:pPr>
         <w:pStyle w:val="Heading2"/>
       </w:pPr>
+      <w:bookmarkStart w:name="h3" w:id="4"/>
       <w:r>
         <w:t xml:space="preserve">2.2 Réseaux</w:t>
       </w:r>
+      <w:bookmarkEnd w:id="4"/>
     </w:p>
     <w:tbl>
       <w:tblPr>
@@ -1108,9 +2405,11 @@
       <w:pPr>
         <w:pStyle w:val="Heading2"/>
       </w:pPr>
+      <w:bookmarkStart w:name="h4" w:id="5"/>
       <w:r>
         <w:t xml:space="preserve">2.3 Machines virtuelles et services</w:t>
       </w:r>
+      <w:bookmarkEnd w:id="5"/>
     </w:p>
     <w:tbl>
       <w:tblPr>
@@ -1887,15 +3186,32 @@
         <w:pStyle w:val="Heading1"/>
         <w:pageBreakBefore/>
       </w:pPr>
-      <w:r>
-        <w:t xml:space="preserve">3. Démonstration 1 — Virtualisation, sauvegardes et réseau (28 septembre)</w:t>
-      </w:r>
+      <w:bookmarkStart w:name="h5" w:id="6"/>
+      <w:r>
+        <w:t xml:space="preserve">3. Démonstration 1 — Virtualisation, sauvegardes et réseau</w:t>
+      </w:r>
+      <w:bookmarkEnd w:id="6"/>
     </w:p>
     <w:p>
       <w:pPr>
         <w:spacing w:after="120"/>
       </w:pPr>
       <w:r>
+        <w:rPr>
+          <w:b/>
+          <w:bCs/>
+        </w:rPr>
+        <w:t xml:space="preserve">Date de la démonstration : </w:t>
+      </w:r>
+      <w:r>
+        <w:t xml:space="preserve">28 septembre 2026</w:t>
+      </w:r>
+    </w:p>
+    <w:p>
+      <w:pPr>
+        <w:spacing w:after="120"/>
+      </w:pPr>
+      <w:r>
         <w:t xml:space="preserve">Cette démonstration met en place le socle de l'infrastructure : l'hyperviseur, le serveur de sauvegarde, les modèles de machines virtuelles et le routeur pare-feu pfSense qui fournit le DHCP et le VPN.</w:t>
       </w:r>
     </w:p>
@@ -1903,9 +3219,11 @@
       <w:pPr>
         <w:pStyle w:val="Heading2"/>
       </w:pPr>
+      <w:bookmarkStart w:name="h6" w:id="7"/>
       <w:r>
         <w:t xml:space="preserve">Étape 1 — Inventaire matériel et câblage</w:t>
       </w:r>
+      <w:bookmarkEnd w:id="7"/>
     </w:p>
     <w:p>
       <w:pPr>
@@ -2920,9 +4238,11 @@
       <w:pPr>
         <w:pStyle w:val="Heading2"/>
       </w:pPr>
+      <w:bookmarkStart w:name="h7" w:id="8"/>
       <w:r>
         <w:t xml:space="preserve">Étape 2 — Installation de Proxmox VE (VIR-QC-PVE-01)</w:t>
       </w:r>
+      <w:bookmarkEnd w:id="8"/>
     </w:p>
     <w:p>
       <w:pPr>
@@ -3319,9 +4639,11 @@
       <w:pPr>
         <w:pStyle w:val="Heading2"/>
       </w:pPr>
+      <w:bookmarkStart w:name="h8" w:id="9"/>
       <w:r>
         <w:t xml:space="preserve">Étape 3 — Proxmox Backup Server (VIR-QC-PBS-01) et console unique</w:t>
       </w:r>
+      <w:bookmarkEnd w:id="9"/>
     </w:p>
     <w:p>
       <w:pPr>
@@ -3735,9 +5057,11 @@
       <w:pPr>
         <w:pStyle w:val="Heading2"/>
       </w:pPr>
+      <w:bookmarkStart w:name="h9" w:id="10"/>
       <w:r>
         <w:t xml:space="preserve">Étape 4 — Modèles de machines virtuelles et clones liés</w:t>
       </w:r>
+      <w:bookmarkEnd w:id="10"/>
     </w:p>
     <w:p>
       <w:pPr>
@@ -3996,9 +5320,11 @@
       <w:pPr>
         <w:pStyle w:val="Heading2"/>
       </w:pPr>
+      <w:bookmarkStart w:name="h10" w:id="11"/>
       <w:r>
         <w:t xml:space="preserve">Étape 5 — Script de création de machine virtuelle</w:t>
       </w:r>
+      <w:bookmarkEnd w:id="11"/>
     </w:p>
     <w:p>
       <w:pPr>
@@ -4339,9 +5665,11 @@
       <w:pPr>
         <w:pStyle w:val="Heading2"/>
       </w:pPr>
+      <w:bookmarkStart w:name="h11" w:id="12"/>
       <w:r>
         <w:t xml:space="preserve">Étape 6 — Sauvegardes planifiées</w:t>
       </w:r>
+      <w:bookmarkEnd w:id="12"/>
     </w:p>
     <w:p>
       <w:pPr>
@@ -4742,9 +6070,11 @@
       <w:pPr>
         <w:pStyle w:val="Heading2"/>
       </w:pPr>
+      <w:bookmarkStart w:name="h12" w:id="13"/>
       <w:r>
         <w:t xml:space="preserve">Étape 7 — pfSense : routeur et pare-feu (VIR-QC-FW-01)</w:t>
       </w:r>
+      <w:bookmarkEnd w:id="13"/>
     </w:p>
     <w:p>
       <w:pPr>
@@ -5113,9 +6443,11 @@
       <w:pPr>
         <w:pStyle w:val="Heading2"/>
       </w:pPr>
+      <w:bookmarkStart w:name="h13" w:id="14"/>
       <w:r>
         <w:t xml:space="preserve">Étape 8 — Service DHCP</w:t>
       </w:r>
+      <w:bookmarkEnd w:id="14"/>
     </w:p>
     <w:p>
       <w:pPr>
@@ -5486,9 +6818,11 @@
       <w:pPr>
         <w:pStyle w:val="Heading2"/>
       </w:pPr>
+      <w:bookmarkStart w:name="h14" w:id="15"/>
       <w:r>
         <w:t xml:space="preserve">Étape 9 — VPN entre le siège et les succursales</w:t>
       </w:r>
+      <w:bookmarkEnd w:id="15"/>
     </w:p>
     <w:p>
       <w:pPr>
@@ -5843,15 +7177,32 @@
         <w:pStyle w:val="Heading1"/>
         <w:pageBreakBefore/>
       </w:pPr>
-      <w:r>
-        <w:t xml:space="preserve">4. Démonstration 2 — Active Directory, GPO, partages et DNS (30 septembre)</w:t>
-      </w:r>
+      <w:bookmarkStart w:name="h15" w:id="16"/>
+      <w:r>
+        <w:t xml:space="preserve">4. Démonstration 2 — Active Directory, GPO, partages et DNS</w:t>
+      </w:r>
+      <w:bookmarkEnd w:id="16"/>
     </w:p>
     <w:p>
       <w:pPr>
         <w:spacing w:after="120"/>
       </w:pPr>
       <w:r>
+        <w:rPr>
+          <w:b/>
+          <w:bCs/>
+        </w:rPr>
+        <w:t xml:space="preserve">Date de la démonstration : </w:t>
+      </w:r>
+      <w:r>
+        <w:t xml:space="preserve">30 septembre 2026</w:t>
+      </w:r>
+    </w:p>
+    <w:p>
+      <w:pPr>
+        <w:spacing w:after="120"/>
+      </w:pPr>
+      <w:r>
         <w:t xml:space="preserve">Cette démonstration met en place l'annuaire de l'entreprise, ses 200 comptes, les stratégies de groupe, les partages de fichiers et le service DNS.</w:t>
       </w:r>
     </w:p>
@@ -5859,9 +7210,11 @@
       <w:pPr>
         <w:pStyle w:val="Heading2"/>
       </w:pPr>
+      <w:bookmarkStart w:name="h16" w:id="17"/>
       <w:r>
         <w:t xml:space="preserve">Étape 10 — Contrôleur de domaine principal (VIR-QC-DC-01)</w:t>
       </w:r>
+      <w:bookmarkEnd w:id="17"/>
     </w:p>
     <w:p>
       <w:pPr>
@@ -6107,9 +7460,11 @@
       <w:pPr>
         <w:pStyle w:val="Heading2"/>
       </w:pPr>
+      <w:bookmarkStart w:name="h17" w:id="18"/>
       <w:r>
         <w:t xml:space="preserve">Étape 11 — Contrôleurs en lecture seule des succursales (RODC)</w:t>
       </w:r>
+      <w:bookmarkEnd w:id="18"/>
     </w:p>
     <w:p>
       <w:pPr>
@@ -6450,9 +7805,11 @@
       <w:pPr>
         <w:pStyle w:val="Heading2"/>
       </w:pPr>
+      <w:bookmarkStart w:name="h18" w:id="19"/>
       <w:r>
         <w:t xml:space="preserve">Étape 12 — Création des utilisateurs et des groupes</w:t>
       </w:r>
+      <w:bookmarkEnd w:id="19"/>
     </w:p>
     <w:p>
       <w:pPr>
@@ -6916,9 +8273,11 @@
       <w:pPr>
         <w:pStyle w:val="Heading2"/>
       </w:pPr>
+      <w:bookmarkStart w:name="h19" w:id="20"/>
       <w:r>
         <w:t xml:space="preserve">Étape 13 — Stratégies de groupe (GPO)</w:t>
       </w:r>
+      <w:bookmarkEnd w:id="20"/>
     </w:p>
     <w:p>
       <w:pPr>
@@ -7397,9 +8756,11 @@
       <w:pPr>
         <w:pStyle w:val="Heading2"/>
       </w:pPr>
+      <w:bookmarkStart w:name="h20" w:id="21"/>
       <w:r>
         <w:t xml:space="preserve">Étape 14 — Partages et lecteurs réseau</w:t>
       </w:r>
+      <w:bookmarkEnd w:id="21"/>
     </w:p>
     <w:p>
       <w:pPr>
@@ -7770,9 +9131,11 @@
       <w:pPr>
         <w:pStyle w:val="Heading2"/>
       </w:pPr>
+      <w:bookmarkStart w:name="h21" w:id="22"/>
       <w:r>
         <w:t xml:space="preserve">Étape 15 — Service DNS principal et secondaire</w:t>
       </w:r>
+      <w:bookmarkEnd w:id="22"/>
     </w:p>
     <w:p>
       <w:pPr>
@@ -8404,9 +9767,11 @@
       <w:pPr>
         <w:pStyle w:val="Heading2"/>
       </w:pPr>
+      <w:bookmarkStart w:name="h22" w:id="23"/>
       <w:r>
         <w:t xml:space="preserve">Étape 16 — Poste de travail Windows 11 (VIR-QC-WS-01)</w:t>
       </w:r>
+      <w:bookmarkEnd w:id="23"/>
     </w:p>
     <w:p>
       <w:pPr>
@@ -8884,15 +10249,32 @@
         <w:pStyle w:val="Heading1"/>
         <w:pageBreakBefore/>
       </w:pPr>
-      <w:r>
-        <w:t xml:space="preserve">5. Démonstration 3 — Stockage TrueNAS (6 octobre)</w:t>
-      </w:r>
+      <w:bookmarkStart w:name="h23" w:id="24"/>
+      <w:r>
+        <w:t xml:space="preserve">5. Démonstration 3 — Stockage TrueNAS</w:t>
+      </w:r>
+      <w:bookmarkEnd w:id="24"/>
     </w:p>
     <w:p>
       <w:pPr>
         <w:spacing w:after="120"/>
       </w:pPr>
       <w:r>
+        <w:rPr>
+          <w:b/>
+          <w:bCs/>
+        </w:rPr>
+        <w:t xml:space="preserve">Date de la démonstration : </w:t>
+      </w:r>
+      <w:r>
+        <w:t xml:space="preserve">6 octobre 2026</w:t>
+      </w:r>
+    </w:p>
+    <w:p>
+      <w:pPr>
+        <w:spacing w:after="120"/>
+      </w:pPr>
+      <w:r>
         <w:t xml:space="preserve">Cette démonstration met en place le serveur de stockage redondant et ses partages NFS et SMB.</w:t>
       </w:r>
     </w:p>
@@ -8900,9 +10282,11 @@
       <w:pPr>
         <w:pStyle w:val="Heading2"/>
       </w:pPr>
+      <w:bookmarkStart w:name="h24" w:id="25"/>
       <w:r>
         <w:t xml:space="preserve">Étape 17 — Installation de TrueNAS (VIR-QC-NAS-01)</w:t>
       </w:r>
+      <w:bookmarkEnd w:id="25"/>
     </w:p>
     <w:p>
       <w:pPr>
@@ -9133,9 +10517,11 @@
       <w:pPr>
         <w:pStyle w:val="Heading2"/>
       </w:pPr>
+      <w:bookmarkStart w:name="h25" w:id="26"/>
       <w:r>
         <w:t xml:space="preserve">Étape 18 — Volumes redondants : RAID 1, RAID 5 et LVM</w:t>
       </w:r>
+      <w:bookmarkEnd w:id="26"/>
     </w:p>
     <w:p>
       <w:pPr>
@@ -9489,9 +10875,11 @@
       <w:pPr>
         <w:pStyle w:val="Heading2"/>
       </w:pPr>
+      <w:bookmarkStart w:name="h26" w:id="27"/>
       <w:r>
         <w:t xml:space="preserve">Étape 19 — Partages NFS et SMB2</w:t>
       </w:r>
+      <w:bookmarkEnd w:id="27"/>
     </w:p>
     <w:p>
       <w:pPr>
@@ -9848,15 +11236,32 @@
         <w:pStyle w:val="Heading1"/>
         <w:pageBreakBefore/>
       </w:pPr>
-      <w:r>
-        <w:t xml:space="preserve">6. Démonstration 4 — NextCloud et supervision (8 octobre)</w:t>
-      </w:r>
+      <w:bookmarkStart w:name="h27" w:id="28"/>
+      <w:r>
+        <w:t xml:space="preserve">6. Démonstration 4 — NextCloud et supervision</w:t>
+      </w:r>
+      <w:bookmarkEnd w:id="28"/>
     </w:p>
     <w:p>
       <w:pPr>
         <w:spacing w:after="120"/>
       </w:pPr>
       <w:r>
+        <w:rPr>
+          <w:b/>
+          <w:bCs/>
+        </w:rPr>
+        <w:t xml:space="preserve">Date de la démonstration : </w:t>
+      </w:r>
+      <w:r>
+        <w:t xml:space="preserve">8 octobre 2026</w:t>
+      </w:r>
+    </w:p>
+    <w:p>
+      <w:pPr>
+        <w:spacing w:after="120"/>
+      </w:pPr>
+      <w:r>
         <w:t xml:space="preserve">Cette démonstration déploie deux services en conteneurs : le partage de fichiers NextCloud et la supervision.</w:t>
       </w:r>
     </w:p>
@@ -9864,9 +11269,11 @@
       <w:pPr>
         <w:pStyle w:val="Heading2"/>
       </w:pPr>
+      <w:bookmarkStart w:name="h28" w:id="29"/>
       <w:r>
         <w:t xml:space="preserve">Étape 20 — NextCloud en conteneur (VIR-QC-NC-01)</w:t>
       </w:r>
+      <w:bookmarkEnd w:id="29"/>
     </w:p>
     <w:p>
       <w:pPr>
@@ -10222,9 +11629,11 @@
       <w:pPr>
         <w:pStyle w:val="Heading2"/>
       </w:pPr>
+      <w:bookmarkStart w:name="h29" w:id="30"/>
       <w:r>
         <w:t xml:space="preserve">Étape 21 — Service de supervision (VIR-QC-MON-01)</w:t>
       </w:r>
+      <w:bookmarkEnd w:id="30"/>
     </w:p>
     <w:p>
       <w:pPr>
@@ -10455,9 +11864,11 @@
       <w:pPr>
         <w:pStyle w:val="Heading2"/>
       </w:pPr>
+      <w:bookmarkStart w:name="h30" w:id="31"/>
       <w:r>
         <w:t xml:space="preserve">Étape 22 — Gestion des conteneurs avec Dockhand</w:t>
       </w:r>
+      <w:bookmarkEnd w:id="31"/>
     </w:p>
     <w:p>
       <w:pPr>
@@ -10661,15 +12072,32 @@
         <w:pStyle w:val="Heading1"/>
         <w:pageBreakBefore/>
       </w:pPr>
-      <w:r>
-        <w:t xml:space="preserve">7. Démonstration 5 — Site Web sécurisé, supervision et pare-feux d'hôtes (9 octobre)</w:t>
-      </w:r>
+      <w:bookmarkStart w:name="h31" w:id="32"/>
+      <w:r>
+        <w:t xml:space="preserve">7. Démonstration 5 — Site Web, supervision et pare-feux</w:t>
+      </w:r>
+      <w:bookmarkEnd w:id="32"/>
     </w:p>
     <w:p>
       <w:pPr>
         <w:spacing w:after="120"/>
       </w:pPr>
       <w:r>
+        <w:rPr>
+          <w:b/>
+          <w:bCs/>
+        </w:rPr>
+        <w:t xml:space="preserve">Date de la démonstration : </w:t>
+      </w:r>
+      <w:r>
+        <w:t xml:space="preserve">9 octobre 2026</w:t>
+      </w:r>
+    </w:p>
+    <w:p>
+      <w:pPr>
+        <w:spacing w:after="120"/>
+      </w:pPr>
+      <w:r>
         <w:t xml:space="preserve">Cette démonstration termine le projet avec l'intranet sécurisé, la supervision complète, l'automatisation et la sécurité des hôtes.</w:t>
       </w:r>
     </w:p>
@@ -10677,9 +12105,11 @@
       <w:pPr>
         <w:pStyle w:val="Heading2"/>
       </w:pPr>
+      <w:bookmarkStart w:name="h32" w:id="33"/>
       <w:r>
         <w:t xml:space="preserve">Étape 23 — Site Web sécurisé HTTPS (VIR-QC-WEB-01)</w:t>
       </w:r>
+      <w:bookmarkEnd w:id="33"/>
     </w:p>
     <w:p>
       <w:pPr>
@@ -11065,9 +12495,11 @@
       <w:pPr>
         <w:pStyle w:val="Heading2"/>
       </w:pPr>
+      <w:bookmarkStart w:name="h33" w:id="34"/>
       <w:r>
         <w:t xml:space="preserve">Étape 24 — Supervision d'un serveur Windows et d'un serveur Linux</w:t>
       </w:r>
+      <w:bookmarkEnd w:id="34"/>
     </w:p>
     <w:p>
       <w:pPr>
@@ -11352,9 +12784,11 @@
       <w:pPr>
         <w:pStyle w:val="Heading2"/>
       </w:pPr>
+      <w:bookmarkStart w:name="h34" w:id="35"/>
       <w:r>
         <w:t xml:space="preserve">Étape 25 — Pare-feux d'hôtes</w:t>
       </w:r>
+      <w:bookmarkEnd w:id="35"/>
     </w:p>
     <w:p>
       <w:pPr>
@@ -11680,9 +13114,11 @@
       <w:pPr>
         <w:pStyle w:val="Heading2"/>
       </w:pPr>
+      <w:bookmarkStart w:name="h35" w:id="36"/>
       <w:r>
         <w:t xml:space="preserve">Étape 26 — Automatisation avec Ansible (VIR-QC-ANS-01)</w:t>
       </w:r>
+      <w:bookmarkEnd w:id="36"/>
     </w:p>
     <w:p>
       <w:pPr>
@@ -12052,9 +13488,11 @@
         <w:pStyle w:val="Heading1"/>
         <w:pageBreakBefore/>
       </w:pPr>
+      <w:bookmarkStart w:name="h36" w:id="37"/>
       <w:r>
         <w:t xml:space="preserve">8. Synthèse de la sécurité de l'infrastructure</w:t>
       </w:r>
+      <w:bookmarkEnd w:id="37"/>
     </w:p>
     <w:p>
       <w:pPr>
@@ -12150,9 +13588,11 @@
         <w:pStyle w:val="Heading1"/>
         <w:pageBreakBefore/>
       </w:pPr>
+      <w:bookmarkStart w:name="h37" w:id="38"/>
       <w:r>
         <w:t xml:space="preserve">9. Conclusions</w:t>
       </w:r>
+      <w:bookmarkEnd w:id="38"/>
     </w:p>
     <w:p>
       <w:pPr>
@@ -12166,9 +13606,11 @@
       <w:pPr>
         <w:pStyle w:val="Heading2"/>
       </w:pPr>
+      <w:bookmarkStart w:name="h38" w:id="39"/>
       <w:r>
         <w:t xml:space="preserve">Conclusion de [Nom 1]</w:t>
       </w:r>
+      <w:bookmarkEnd w:id="39"/>
     </w:p>
     <w:p>
       <w:pPr>
@@ -12198,9 +13640,11 @@
       <w:pPr>
         <w:pStyle w:val="Heading2"/>
       </w:pPr>
+      <w:bookmarkStart w:name="h39" w:id="40"/>
       <w:r>
         <w:t xml:space="preserve">Conclusion de [Nom 2]</w:t>
       </w:r>
+      <w:bookmarkEnd w:id="40"/>
     </w:p>
     <w:p>
       <w:pPr>
@@ -12230,9 +13674,11 @@
       <w:pPr>
         <w:pStyle w:val="Heading2"/>
       </w:pPr>
+      <w:bookmarkStart w:name="h40" w:id="41"/>
       <w:r>
         <w:t xml:space="preserve">Conclusion de [Nom 3]</w:t>
       </w:r>
+      <w:bookmarkEnd w:id="41"/>
     </w:p>
     <w:p>
       <w:pPr>
@@ -12262,9 +13708,11 @@
       <w:pPr>
         <w:pStyle w:val="Heading2"/>
       </w:pPr>
+      <w:bookmarkStart w:name="h41" w:id="42"/>
       <w:r>
         <w:t xml:space="preserve">Conclusion de [Nom 4]</w:t>
       </w:r>
+      <w:bookmarkEnd w:id="42"/>
     </w:p>
     <w:p>
       <w:pPr>
@@ -12295,9 +13743,11 @@
         <w:pStyle w:val="Heading1"/>
         <w:pageBreakBefore/>
       </w:pPr>
+      <w:bookmarkStart w:name="h42" w:id="43"/>
       <w:r>
         <w:t xml:space="preserve">10. Webographie</w:t>
       </w:r>
+      <w:bookmarkEnd w:id="43"/>
     </w:p>
     <w:p>
       <w:pPr>
@@ -12512,9 +13962,11 @@
         <w:pStyle w:val="Heading1"/>
         <w:pageBreakBefore/>
       </w:pPr>
+      <w:bookmarkStart w:name="h43" w:id="44"/>
       <w:r>
         <w:t xml:space="preserve">11. Annexe — Scripts utilisés</w:t>
       </w:r>
+      <w:bookmarkEnd w:id="44"/>
     </w:p>
     <w:p>
       <w:pPr>

</xml_diff>

<commit_message>
Rapport final : topologie physique intégrée et adresses alignées sur le plan d'adressage
Co-Authored-By: Claude Opus 5.5 <noreply@anthropic.com>
Claude-Session: https://claude.ai/code/session_01H1sf4zDq3Hzk1M44xBfVAb
</commit_message>
<xml_diff>
--- a/rapport/Rapport_final_Equipe04.docx
+++ b/rapport/Rapport_final_Equipe04.docx
@@ -387,7 +387,7 @@
             <w:sz w:val="20"/>
             <w:szCs w:val="20"/>
           </w:rPr>
-          <w:t xml:space="preserve">2.1 Serveurs physiques</w:t>
+          <w:t xml:space="preserve">2.1 Équipements physiques</w:t>
         </w:r>
         <w:r>
           <w:rPr>
@@ -417,7 +417,7 @@
             <w:sz w:val="20"/>
             <w:szCs w:val="20"/>
           </w:rPr>
-          <w:t xml:space="preserve">2.2 Réseaux</w:t>
+          <w:t xml:space="preserve">2.2 Plan d'adressage global</w:t>
         </w:r>
         <w:r>
           <w:rPr>
@@ -427,7 +427,7 @@
             <w:szCs w:val="20"/>
           </w:rPr>
           <w:tab/>
-          <w:t xml:space="preserve">5</w:t>
+          <w:t xml:space="preserve">6</w:t>
         </w:r>
       </w:hyperlink>
     </w:p>
@@ -457,7 +457,7 @@
             <w:szCs w:val="20"/>
           </w:rPr>
           <w:tab/>
-          <w:t xml:space="preserve">5</w:t>
+          <w:t xml:space="preserve">6</w:t>
         </w:r>
       </w:hyperlink>
     </w:p>
@@ -1703,11 +1703,95 @@
     </w:p>
     <w:p>
       <w:pPr>
+        <w:spacing w:after="120"/>
+      </w:pPr>
+      <w:r>
+        <w:t xml:space="preserve">L'infrastructure couvre quatre sites : le siège de Québec, entièrement déployé, la succursale de Montréal, partiellement déployée, et celles de Sherbrooke et de Trois-Rivières, planifiées. Chaque succursale est reliée au siège par un tunnel VPN IPsec.</w:t>
+      </w:r>
+    </w:p>
+    <w:p>
+      <w:pPr>
+        <w:spacing w:before="120"/>
+        <w:jc w:val="center"/>
+      </w:pPr>
+      <w:r>
+        <w:drawing>
+          <wp:inline distT="0" distB="0" distL="0" distR="0">
+            <wp:extent cx="5943600" cy="3962400"/>
+            <wp:effectExtent t="0" r="0" b="0" l="0"/>
+            <wp:docPr id="1" name="topologie" descr="Topologie physique de VIREXON Technologies" title="Topologie physique"/>
+            <wp:cNvGraphicFramePr>
+              <a:graphicFrameLocks xmlns:a="http://schemas.openxmlformats.org/drawingml/2006/main" noChangeAspect="1"/>
+            </wp:cNvGraphicFramePr>
+            <a:graphic xmlns:a="http://schemas.openxmlformats.org/drawingml/2006/main">
+              <a:graphicData uri="http://schemas.openxmlformats.org/drawingml/2006/picture">
+                <pic:pic xmlns:pic="http://schemas.openxmlformats.org/drawingml/2006/picture">
+                  <pic:nvPicPr>
+                    <pic:cNvPr id="0" name="" descr=""/>
+                    <pic:cNvPicPr>
+                      <a:picLocks noChangeAspect="1" noChangeArrowheads="1"/>
+                    </pic:cNvPicPr>
+                  </pic:nvPicPr>
+                  <pic:blipFill>
+                    <a:blip r:embed="rId9" cstate="none"/>
+                    <a:srcRect/>
+                    <a:stretch>
+                      <a:fillRect/>
+                    </a:stretch>
+                  </pic:blipFill>
+                  <pic:spPr bwMode="auto">
+                    <a:xfrm>
+                      <a:off x="0" y="0"/>
+                      <a:ext cx="5943600" cy="3962400"/>
+                    </a:xfrm>
+                    <a:prstGeom prst="rect">
+                      <a:avLst/>
+                    </a:prstGeom>
+                  </pic:spPr>
+                </pic:pic>
+              </a:graphicData>
+            </a:graphic>
+          </wp:inline>
+        </w:drawing>
+      </w:r>
+    </w:p>
+    <w:p>
+      <w:pPr>
+        <w:spacing w:after="60" w:before="80"/>
+        <w:jc w:val="center"/>
+      </w:pPr>
+      <w:r>
+        <w:rPr>
+          <w:i/>
+          <w:iCs/>
+          <w:sz w:val="20"/>
+          <w:szCs w:val="20"/>
+        </w:rPr>
+        <w:t xml:space="preserve">Figure 1 — Topologie physique de VIREXON Technologies</w:t>
+      </w:r>
+    </w:p>
+    <w:p>
+      <w:pPr>
+        <w:spacing w:after="120"/>
+      </w:pPr>
+      <w:r>
+        <w:rPr>
+          <w:b/>
+          <w:bCs/>
+        </w:rPr>
+        <w:t xml:space="preserve">Commentaire : </w:t>
+      </w:r>
+      <w:r>
+        <w:t xml:space="preserve">au siège, le réseau de gestion (vmbr0, 192.168.160.0/24) relie Proxmox VE, PBS et le poste d'administration. Les machines virtuelles sont sur vmbr1 (192.168.161.0/24), derrière le pare-feu VIR-QC-FW-01, qui sort vers le réseau de l'école (10.70.0.0/16) et porte les tunnels IPsec vers les succursales.</w:t>
+      </w:r>
+    </w:p>
+    <w:p>
+      <w:pPr>
         <w:pStyle w:val="Heading2"/>
       </w:pPr>
       <w:bookmarkStart w:name="h2" w:id="3"/>
       <w:r>
-        <w:t xml:space="preserve">2.1 Serveurs physiques</w:t>
+        <w:t xml:space="preserve">2.1 Équipements physiques</w:t>
       </w:r>
       <w:bookmarkEnd w:id="3"/>
     </w:p>
@@ -2020,6 +2104,289 @@
           </w:p>
         </w:tc>
       </w:tr>
+      <w:tr>
+        <w:trPr>
+          <w:tblHeader w:val="off"/>
+        </w:trPr>
+        <w:tc>
+          <w:tcPr>
+            <w:tcW w:type="dxa" w:w="1600"/>
+            <w:tcMar>
+              <w:top w:type="dxa" w:w="60"/>
+              <w:left w:type="dxa" w:w="100"/>
+              <w:bottom w:type="dxa" w:w="60"/>
+              <w:right w:type="dxa" w:w="100"/>
+            </w:tcMar>
+          </w:tcPr>
+          <w:p>
+            <w:r>
+              <w:rPr>
+                <w:b w:val="false"/>
+                <w:bCs w:val="false"/>
+                <w:sz w:val="20"/>
+                <w:szCs w:val="20"/>
+              </w:rPr>
+              <w:t xml:space="preserve">Commutateur</w:t>
+            </w:r>
+          </w:p>
+        </w:tc>
+        <w:tc>
+          <w:tcPr>
+            <w:tcW w:type="dxa" w:w="2200"/>
+            <w:tcMar>
+              <w:top w:type="dxa" w:w="60"/>
+              <w:left w:type="dxa" w:w="100"/>
+              <w:bottom w:type="dxa" w:w="60"/>
+              <w:right w:type="dxa" w:w="100"/>
+            </w:tcMar>
+          </w:tcPr>
+          <w:p>
+            <w:r>
+              <w:rPr>
+                <w:b w:val="false"/>
+                <w:bCs w:val="false"/>
+                <w:sz w:val="20"/>
+                <w:szCs w:val="20"/>
+              </w:rPr>
+              <w:t xml:space="preserve">VIR-QC-SW-01</w:t>
+            </w:r>
+          </w:p>
+        </w:tc>
+        <w:tc>
+          <w:tcPr>
+            <w:tcW w:type="dxa" w:w="3160"/>
+            <w:tcMar>
+              <w:top w:type="dxa" w:w="60"/>
+              <w:left w:type="dxa" w:w="100"/>
+              <w:bottom w:type="dxa" w:w="60"/>
+              <w:right w:type="dxa" w:w="100"/>
+            </w:tcMar>
+          </w:tcPr>
+          <w:p>
+            <w:r>
+              <w:rPr>
+                <w:b w:val="false"/>
+                <w:bCs w:val="false"/>
+                <w:sz w:val="20"/>
+                <w:szCs w:val="20"/>
+              </w:rPr>
+              <w:t xml:space="preserve">Commutateur de gestion (vmbr0)</w:t>
+            </w:r>
+          </w:p>
+        </w:tc>
+        <w:tc>
+          <w:tcPr>
+            <w:tcW w:type="dxa" w:w="2400"/>
+            <w:tcMar>
+              <w:top w:type="dxa" w:w="60"/>
+              <w:left w:type="dxa" w:w="100"/>
+              <w:bottom w:type="dxa" w:w="60"/>
+              <w:right w:type="dxa" w:w="100"/>
+            </w:tcMar>
+          </w:tcPr>
+          <w:p>
+            <w:r>
+              <w:rPr>
+                <w:b w:val="false"/>
+                <w:bCs w:val="false"/>
+                <w:sz w:val="20"/>
+                <w:szCs w:val="20"/>
+              </w:rPr>
+              <w:t xml:space="preserve">192.168.160.1</w:t>
+            </w:r>
+          </w:p>
+        </w:tc>
+      </w:tr>
+      <w:tr>
+        <w:trPr>
+          <w:tblHeader w:val="off"/>
+        </w:trPr>
+        <w:tc>
+          <w:tcPr>
+            <w:tcW w:type="dxa" w:w="1600"/>
+            <w:shd w:fill="F3F6FA" w:color="auto" w:val="clear"/>
+            <w:tcMar>
+              <w:top w:type="dxa" w:w="60"/>
+              <w:left w:type="dxa" w:w="100"/>
+              <w:bottom w:type="dxa" w:w="60"/>
+              <w:right w:type="dxa" w:w="100"/>
+            </w:tcMar>
+          </w:tcPr>
+          <w:p>
+            <w:r>
+              <w:rPr>
+                <w:b w:val="false"/>
+                <w:bCs w:val="false"/>
+                <w:sz w:val="20"/>
+                <w:szCs w:val="20"/>
+              </w:rPr>
+              <w:t xml:space="preserve">Commutateur</w:t>
+            </w:r>
+          </w:p>
+        </w:tc>
+        <w:tc>
+          <w:tcPr>
+            <w:tcW w:type="dxa" w:w="2200"/>
+            <w:shd w:fill="F3F6FA" w:color="auto" w:val="clear"/>
+            <w:tcMar>
+              <w:top w:type="dxa" w:w="60"/>
+              <w:left w:type="dxa" w:w="100"/>
+              <w:bottom w:type="dxa" w:w="60"/>
+              <w:right w:type="dxa" w:w="100"/>
+            </w:tcMar>
+          </w:tcPr>
+          <w:p>
+            <w:r>
+              <w:rPr>
+                <w:b w:val="false"/>
+                <w:bCs w:val="false"/>
+                <w:sz w:val="20"/>
+                <w:szCs w:val="20"/>
+              </w:rPr>
+              <w:t xml:space="preserve">VIR-QC-SW-02</w:t>
+            </w:r>
+          </w:p>
+        </w:tc>
+        <w:tc>
+          <w:tcPr>
+            <w:tcW w:type="dxa" w:w="3160"/>
+            <w:shd w:fill="F3F6FA" w:color="auto" w:val="clear"/>
+            <w:tcMar>
+              <w:top w:type="dxa" w:w="60"/>
+              <w:left w:type="dxa" w:w="100"/>
+              <w:bottom w:type="dxa" w:w="60"/>
+              <w:right w:type="dxa" w:w="100"/>
+            </w:tcMar>
+          </w:tcPr>
+          <w:p>
+            <w:r>
+              <w:rPr>
+                <w:b w:val="false"/>
+                <w:bCs w:val="false"/>
+                <w:sz w:val="20"/>
+                <w:szCs w:val="20"/>
+              </w:rPr>
+              <w:t xml:space="preserve">Commutateur du réseau des VM (vmbr1)</w:t>
+            </w:r>
+          </w:p>
+        </w:tc>
+        <w:tc>
+          <w:tcPr>
+            <w:tcW w:type="dxa" w:w="2400"/>
+            <w:shd w:fill="F3F6FA" w:color="auto" w:val="clear"/>
+            <w:tcMar>
+              <w:top w:type="dxa" w:w="60"/>
+              <w:left w:type="dxa" w:w="100"/>
+              <w:bottom w:type="dxa" w:w="60"/>
+              <w:right w:type="dxa" w:w="100"/>
+            </w:tcMar>
+          </w:tcPr>
+          <w:p>
+            <w:r>
+              <w:rPr>
+                <w:b w:val="false"/>
+                <w:bCs w:val="false"/>
+                <w:sz w:val="20"/>
+                <w:szCs w:val="20"/>
+              </w:rPr>
+              <w:t xml:space="preserve">192.168.161.2</w:t>
+            </w:r>
+          </w:p>
+        </w:tc>
+      </w:tr>
+      <w:tr>
+        <w:trPr>
+          <w:tblHeader w:val="off"/>
+        </w:trPr>
+        <w:tc>
+          <w:tcPr>
+            <w:tcW w:type="dxa" w:w="1600"/>
+            <w:tcMar>
+              <w:top w:type="dxa" w:w="60"/>
+              <w:left w:type="dxa" w:w="100"/>
+              <w:bottom w:type="dxa" w:w="60"/>
+              <w:right w:type="dxa" w:w="100"/>
+            </w:tcMar>
+          </w:tcPr>
+          <w:p>
+            <w:r>
+              <w:rPr>
+                <w:b w:val="false"/>
+                <w:bCs w:val="false"/>
+                <w:sz w:val="20"/>
+                <w:szCs w:val="20"/>
+              </w:rPr>
+              <w:t xml:space="preserve">Poste</w:t>
+            </w:r>
+          </w:p>
+        </w:tc>
+        <w:tc>
+          <w:tcPr>
+            <w:tcW w:type="dxa" w:w="2200"/>
+            <w:tcMar>
+              <w:top w:type="dxa" w:w="60"/>
+              <w:left w:type="dxa" w:w="100"/>
+              <w:bottom w:type="dxa" w:w="60"/>
+              <w:right w:type="dxa" w:w="100"/>
+            </w:tcMar>
+          </w:tcPr>
+          <w:p>
+            <w:r>
+              <w:rPr>
+                <w:b w:val="false"/>
+                <w:bCs w:val="false"/>
+                <w:sz w:val="20"/>
+                <w:szCs w:val="20"/>
+              </w:rPr>
+              <w:t xml:space="preserve">VIR-QC-WS-01</w:t>
+            </w:r>
+          </w:p>
+        </w:tc>
+        <w:tc>
+          <w:tcPr>
+            <w:tcW w:type="dxa" w:w="3160"/>
+            <w:tcMar>
+              <w:top w:type="dxa" w:w="60"/>
+              <w:left w:type="dxa" w:w="100"/>
+              <w:bottom w:type="dxa" w:w="60"/>
+              <w:right w:type="dxa" w:w="100"/>
+            </w:tcMar>
+          </w:tcPr>
+          <w:p>
+            <w:r>
+              <w:rPr>
+                <w:b w:val="false"/>
+                <w:bCs w:val="false"/>
+                <w:sz w:val="20"/>
+                <w:szCs w:val="20"/>
+              </w:rPr>
+              <w:t xml:space="preserve">Poste d'administration</w:t>
+            </w:r>
+          </w:p>
+        </w:tc>
+        <w:tc>
+          <w:tcPr>
+            <w:tcW w:type="dxa" w:w="2400"/>
+            <w:tcMar>
+              <w:top w:type="dxa" w:w="60"/>
+              <w:left w:type="dxa" w:w="100"/>
+              <w:bottom w:type="dxa" w:w="60"/>
+              <w:right w:type="dxa" w:w="100"/>
+            </w:tcMar>
+          </w:tcPr>
+          <w:p>
+            <w:r>
+              <w:rPr>
+                <w:b w:val="false"/>
+                <w:bCs w:val="false"/>
+                <w:sz w:val="20"/>
+                <w:szCs w:val="20"/>
+              </w:rPr>
+              <w:t xml:space="preserve">192.168.160.10</w:t>
+            </w:r>
+          </w:p>
+        </w:tc>
+      </w:tr>
     </w:tbl>
     <w:p>
       <w:pPr>
@@ -2027,7 +2394,7 @@
       </w:pPr>
       <w:bookmarkStart w:name="h3" w:id="4"/>
       <w:r>
-        <w:t xml:space="preserve">2.2 Réseaux</w:t>
+        <w:t xml:space="preserve">2.2 Plan d'adressage global</w:t>
       </w:r>
       <w:bookmarkEnd w:id="4"/>
     </w:p>
@@ -2044,8 +2411,11 @@
         </w:tblBorders>
       </w:tblPr>
       <w:tblGrid>
-        <w:gridCol w:w="3000"/>
-        <w:gridCol w:w="6360"/>
+        <w:gridCol w:w="1950"/>
+        <w:gridCol w:w="2000"/>
+        <w:gridCol w:w="1850"/>
+        <w:gridCol w:w="1610"/>
+        <w:gridCol w:w="1950"/>
       </w:tblGrid>
       <w:tr>
         <w:trPr>
@@ -2053,7 +2423,7 @@
         </w:trPr>
         <w:tc>
           <w:tcPr>
-            <w:tcW w:type="dxa" w:w="3000"/>
+            <w:tcW w:type="dxa" w:w="1950"/>
             <w:shd w:fill="1F4E79" w:color="auto" w:val="clear"/>
             <w:tcMar>
               <w:top w:type="dxa" w:w="60"/>
@@ -2071,13 +2441,13 @@
                 <w:sz w:val="20"/>
                 <w:szCs w:val="20"/>
               </w:rPr>
-              <w:t xml:space="preserve">Réseau</w:t>
-            </w:r>
-          </w:p>
-        </w:tc>
-        <w:tc>
-          <w:tcPr>
-            <w:tcW w:type="dxa" w:w="6360"/>
+              <w:t xml:space="preserve">Site</w:t>
+            </w:r>
+          </w:p>
+        </w:tc>
+        <w:tc>
+          <w:tcPr>
+            <w:tcW w:type="dxa" w:w="2000"/>
             <w:shd w:fill="1F4E79" w:color="auto" w:val="clear"/>
             <w:tcMar>
               <w:top w:type="dxa" w:w="60"/>
@@ -2095,18 +2465,14 @@
                 <w:sz w:val="20"/>
                 <w:szCs w:val="20"/>
               </w:rPr>
-              <w:t xml:space="preserve">Usage</w:t>
-            </w:r>
-          </w:p>
-        </w:tc>
-      </w:tr>
-      <w:tr>
-        <w:trPr>
-          <w:tblHeader w:val="off"/>
-        </w:trPr>
-        <w:tc>
-          <w:tcPr>
-            <w:tcW w:type="dxa" w:w="3000"/>
+              <w:t xml:space="preserve">Sous-réseau</w:t>
+            </w:r>
+          </w:p>
+        </w:tc>
+        <w:tc>
+          <w:tcPr>
+            <w:tcW w:type="dxa" w:w="1850"/>
+            <w:shd w:fill="1F4E79" w:color="auto" w:val="clear"/>
             <w:tcMar>
               <w:top w:type="dxa" w:w="60"/>
               <w:left w:type="dxa" w:w="100"/>
@@ -2117,18 +2483,20 @@
           <w:p>
             <w:r>
               <w:rPr>
-                <w:b w:val="false"/>
-                <w:bCs w:val="false"/>
-                <w:sz w:val="20"/>
-                <w:szCs w:val="20"/>
-              </w:rPr>
-              <w:t xml:space="preserve">10.70.160.0/24</w:t>
-            </w:r>
-          </w:p>
-        </w:tc>
-        <w:tc>
-          <w:tcPr>
-            <w:tcW w:type="dxa" w:w="6360"/>
+                <w:b/>
+                <w:bCs/>
+                <w:color w:val="FFFFFF"/>
+                <w:sz w:val="20"/>
+                <w:szCs w:val="20"/>
+              </w:rPr>
+              <w:t xml:space="preserve">Masque</w:t>
+            </w:r>
+          </w:p>
+        </w:tc>
+        <w:tc>
+          <w:tcPr>
+            <w:tcW w:type="dxa" w:w="1610"/>
+            <w:shd w:fill="1F4E79" w:color="auto" w:val="clear"/>
             <w:tcMar>
               <w:top w:type="dxa" w:w="60"/>
               <w:left w:type="dxa" w:w="100"/>
@@ -2139,12 +2507,37 @@
           <w:p>
             <w:r>
               <w:rPr>
-                <w:b w:val="false"/>
-                <w:bCs w:val="false"/>
-                <w:sz w:val="20"/>
-                <w:szCs w:val="20"/>
-              </w:rPr>
-              <w:t xml:space="preserve">LAN Serveurs et infrastructure (vmbr1 des VM)</w:t>
+                <w:b/>
+                <w:bCs/>
+                <w:color w:val="FFFFFF"/>
+                <w:sz w:val="20"/>
+                <w:szCs w:val="20"/>
+              </w:rPr>
+              <w:t xml:space="preserve">Hôtes utilisables</w:t>
+            </w:r>
+          </w:p>
+        </w:tc>
+        <w:tc>
+          <w:tcPr>
+            <w:tcW w:type="dxa" w:w="1950"/>
+            <w:shd w:fill="1F4E79" w:color="auto" w:val="clear"/>
+            <w:tcMar>
+              <w:top w:type="dxa" w:w="60"/>
+              <w:left w:type="dxa" w:w="100"/>
+              <w:bottom w:type="dxa" w:w="60"/>
+              <w:right w:type="dxa" w:w="100"/>
+            </w:tcMar>
+          </w:tcPr>
+          <w:p>
+            <w:r>
+              <w:rPr>
+                <w:b/>
+                <w:bCs/>
+                <w:color w:val="FFFFFF"/>
+                <w:sz w:val="20"/>
+                <w:szCs w:val="20"/>
+              </w:rPr>
+              <w:t xml:space="preserve">Passerelle</w:t>
             </w:r>
           </w:p>
         </w:tc>
@@ -2155,7 +2548,122 @@
         </w:trPr>
         <w:tc>
           <w:tcPr>
-            <w:tcW w:type="dxa" w:w="3000"/>
+            <w:tcW w:type="dxa" w:w="1950"/>
+            <w:tcMar>
+              <w:top w:type="dxa" w:w="60"/>
+              <w:left w:type="dxa" w:w="100"/>
+              <w:bottom w:type="dxa" w:w="60"/>
+              <w:right w:type="dxa" w:w="100"/>
+            </w:tcMar>
+          </w:tcPr>
+          <w:p>
+            <w:r>
+              <w:rPr>
+                <w:b w:val="false"/>
+                <w:bCs w:val="false"/>
+                <w:sz w:val="20"/>
+                <w:szCs w:val="20"/>
+              </w:rPr>
+              <w:t xml:space="preserve">Gestion (vmbr0)</w:t>
+            </w:r>
+          </w:p>
+        </w:tc>
+        <w:tc>
+          <w:tcPr>
+            <w:tcW w:type="dxa" w:w="2000"/>
+            <w:tcMar>
+              <w:top w:type="dxa" w:w="60"/>
+              <w:left w:type="dxa" w:w="100"/>
+              <w:bottom w:type="dxa" w:w="60"/>
+              <w:right w:type="dxa" w:w="100"/>
+            </w:tcMar>
+          </w:tcPr>
+          <w:p>
+            <w:r>
+              <w:rPr>
+                <w:b w:val="false"/>
+                <w:bCs w:val="false"/>
+                <w:sz w:val="20"/>
+                <w:szCs w:val="20"/>
+              </w:rPr>
+              <w:t xml:space="preserve">192.168.160.0/24</w:t>
+            </w:r>
+          </w:p>
+        </w:tc>
+        <w:tc>
+          <w:tcPr>
+            <w:tcW w:type="dxa" w:w="1850"/>
+            <w:tcMar>
+              <w:top w:type="dxa" w:w="60"/>
+              <w:left w:type="dxa" w:w="100"/>
+              <w:bottom w:type="dxa" w:w="60"/>
+              <w:right w:type="dxa" w:w="100"/>
+            </w:tcMar>
+          </w:tcPr>
+          <w:p>
+            <w:r>
+              <w:rPr>
+                <w:b w:val="false"/>
+                <w:bCs w:val="false"/>
+                <w:sz w:val="20"/>
+                <w:szCs w:val="20"/>
+              </w:rPr>
+              <w:t xml:space="preserve">255.255.255.0</w:t>
+            </w:r>
+          </w:p>
+        </w:tc>
+        <w:tc>
+          <w:tcPr>
+            <w:tcW w:type="dxa" w:w="1610"/>
+            <w:tcMar>
+              <w:top w:type="dxa" w:w="60"/>
+              <w:left w:type="dxa" w:w="100"/>
+              <w:bottom w:type="dxa" w:w="60"/>
+              <w:right w:type="dxa" w:w="100"/>
+            </w:tcMar>
+          </w:tcPr>
+          <w:p>
+            <w:r>
+              <w:rPr>
+                <w:b w:val="false"/>
+                <w:bCs w:val="false"/>
+                <w:sz w:val="20"/>
+                <w:szCs w:val="20"/>
+              </w:rPr>
+              <w:t xml:space="preserve">.1 à .254</w:t>
+            </w:r>
+          </w:p>
+        </w:tc>
+        <w:tc>
+          <w:tcPr>
+            <w:tcW w:type="dxa" w:w="1950"/>
+            <w:tcMar>
+              <w:top w:type="dxa" w:w="60"/>
+              <w:left w:type="dxa" w:w="100"/>
+              <w:bottom w:type="dxa" w:w="60"/>
+              <w:right w:type="dxa" w:w="100"/>
+            </w:tcMar>
+          </w:tcPr>
+          <w:p>
+            <w:r>
+              <w:rPr>
+                <w:b w:val="false"/>
+                <w:bCs w:val="false"/>
+                <w:sz w:val="20"/>
+                <w:szCs w:val="20"/>
+              </w:rPr>
+              <w:t xml:space="preserve">192.168.160.1</w:t>
+            </w:r>
+          </w:p>
+        </w:tc>
+      </w:tr>
+      <w:tr>
+        <w:trPr>
+          <w:tblHeader w:val="off"/>
+        </w:trPr>
+        <w:tc>
+          <w:tcPr>
+            <w:tcW w:type="dxa" w:w="1950"/>
             <w:shd w:fill="F3F6FA" w:color="auto" w:val="clear"/>
             <w:tcMar>
               <w:top w:type="dxa" w:w="60"/>
@@ -2172,13 +2680,13 @@
                 <w:sz w:val="20"/>
                 <w:szCs w:val="20"/>
               </w:rPr>
-              <w:t xml:space="preserve">192.168.160.0/24</w:t>
-            </w:r>
-          </w:p>
-        </w:tc>
-        <w:tc>
-          <w:tcPr>
-            <w:tcW w:type="dxa" w:w="6360"/>
+              <w:t xml:space="preserve">Québec (VIR-QC)</w:t>
+            </w:r>
+          </w:p>
+        </w:tc>
+        <w:tc>
+          <w:tcPr>
+            <w:tcW w:type="dxa" w:w="2000"/>
             <w:shd w:fill="F3F6FA" w:color="auto" w:val="clear"/>
             <w:tcMar>
               <w:top w:type="dxa" w:w="60"/>
@@ -2195,67 +2703,13 @@
                 <w:sz w:val="20"/>
                 <w:szCs w:val="20"/>
               </w:rPr>
-              <w:t xml:space="preserve">Réseau clients et DMZ (DHCP pfSense .100 à .200 ; DMZ .128/25)</w:t>
-            </w:r>
-          </w:p>
-        </w:tc>
-      </w:tr>
-      <w:tr>
-        <w:trPr>
-          <w:tblHeader w:val="off"/>
-        </w:trPr>
-        <w:tc>
-          <w:tcPr>
-            <w:tcW w:type="dxa" w:w="3000"/>
-            <w:tcMar>
-              <w:top w:type="dxa" w:w="60"/>
-              <w:left w:type="dxa" w:w="100"/>
-              <w:bottom w:type="dxa" w:w="60"/>
-              <w:right w:type="dxa" w:w="100"/>
-            </w:tcMar>
-          </w:tcPr>
-          <w:p>
-            <w:r>
-              <w:rPr>
-                <w:b w:val="false"/>
-                <w:bCs w:val="false"/>
-                <w:sz w:val="20"/>
-                <w:szCs w:val="20"/>
-              </w:rPr>
-              <w:t xml:space="preserve">10.70.161.0/24</w:t>
-            </w:r>
-          </w:p>
-        </w:tc>
-        <w:tc>
-          <w:tcPr>
-            <w:tcW w:type="dxa" w:w="6360"/>
-            <w:tcMar>
-              <w:top w:type="dxa" w:w="60"/>
-              <w:left w:type="dxa" w:w="100"/>
-              <w:bottom w:type="dxa" w:w="60"/>
-              <w:right w:type="dxa" w:w="100"/>
-            </w:tcMar>
-          </w:tcPr>
-          <w:p>
-            <w:r>
-              <w:rPr>
-                <w:b w:val="false"/>
-                <w:bCs w:val="false"/>
-                <w:sz w:val="20"/>
-                <w:szCs w:val="20"/>
-              </w:rPr>
-              <w:t xml:space="preserve">Succursale de Montréal (planifiée)</w:t>
-            </w:r>
-          </w:p>
-        </w:tc>
-      </w:tr>
-      <w:tr>
-        <w:trPr>
-          <w:tblHeader w:val="off"/>
-        </w:trPr>
-        <w:tc>
-          <w:tcPr>
-            <w:tcW w:type="dxa" w:w="3000"/>
+              <w:t xml:space="preserve">192.168.161.0/24</w:t>
+            </w:r>
+          </w:p>
+        </w:tc>
+        <w:tc>
+          <w:tcPr>
+            <w:tcW w:type="dxa" w:w="1850"/>
             <w:shd w:fill="F3F6FA" w:color="auto" w:val="clear"/>
             <w:tcMar>
               <w:top w:type="dxa" w:w="60"/>
@@ -2272,13 +2726,13 @@
                 <w:sz w:val="20"/>
                 <w:szCs w:val="20"/>
               </w:rPr>
-              <w:t xml:space="preserve">10.70.162.0/24</w:t>
-            </w:r>
-          </w:p>
-        </w:tc>
-        <w:tc>
-          <w:tcPr>
-            <w:tcW w:type="dxa" w:w="6360"/>
+              <w:t xml:space="preserve">255.255.255.0</w:t>
+            </w:r>
+          </w:p>
+        </w:tc>
+        <w:tc>
+          <w:tcPr>
+            <w:tcW w:type="dxa" w:w="1610"/>
             <w:shd w:fill="F3F6FA" w:color="auto" w:val="clear"/>
             <w:tcMar>
               <w:top w:type="dxa" w:w="60"/>
@@ -2295,67 +2749,13 @@
                 <w:sz w:val="20"/>
                 <w:szCs w:val="20"/>
               </w:rPr>
-              <w:t xml:space="preserve">Succursale de Sherbrooke (planifiée)</w:t>
-            </w:r>
-          </w:p>
-        </w:tc>
-      </w:tr>
-      <w:tr>
-        <w:trPr>
-          <w:tblHeader w:val="off"/>
-        </w:trPr>
-        <w:tc>
-          <w:tcPr>
-            <w:tcW w:type="dxa" w:w="3000"/>
-            <w:tcMar>
-              <w:top w:type="dxa" w:w="60"/>
-              <w:left w:type="dxa" w:w="100"/>
-              <w:bottom w:type="dxa" w:w="60"/>
-              <w:right w:type="dxa" w:w="100"/>
-            </w:tcMar>
-          </w:tcPr>
-          <w:p>
-            <w:r>
-              <w:rPr>
-                <w:b w:val="false"/>
-                <w:bCs w:val="false"/>
-                <w:sz w:val="20"/>
-                <w:szCs w:val="20"/>
-              </w:rPr>
-              <w:t xml:space="preserve">10.70.163.0/24</w:t>
-            </w:r>
-          </w:p>
-        </w:tc>
-        <w:tc>
-          <w:tcPr>
-            <w:tcW w:type="dxa" w:w="6360"/>
-            <w:tcMar>
-              <w:top w:type="dxa" w:w="60"/>
-              <w:left w:type="dxa" w:w="100"/>
-              <w:bottom w:type="dxa" w:w="60"/>
-              <w:right w:type="dxa" w:w="100"/>
-            </w:tcMar>
-          </w:tcPr>
-          <w:p>
-            <w:r>
-              <w:rPr>
-                <w:b w:val="false"/>
-                <w:bCs w:val="false"/>
-                <w:sz w:val="20"/>
-                <w:szCs w:val="20"/>
-              </w:rPr>
-              <w:t xml:space="preserve">Succursale de Trois-Rivières (planifiée)</w:t>
-            </w:r>
-          </w:p>
-        </w:tc>
-      </w:tr>
-      <w:tr>
-        <w:trPr>
-          <w:tblHeader w:val="off"/>
-        </w:trPr>
-        <w:tc>
-          <w:tcPr>
-            <w:tcW w:type="dxa" w:w="3000"/>
+              <w:t xml:space="preserve">.1 à .254</w:t>
+            </w:r>
+          </w:p>
+        </w:tc>
+        <w:tc>
+          <w:tcPr>
+            <w:tcW w:type="dxa" w:w="1950"/>
             <w:shd w:fill="F3F6FA" w:color="auto" w:val="clear"/>
             <w:tcMar>
               <w:top w:type="dxa" w:w="60"/>
@@ -2372,13 +2772,133 @@
                 <w:sz w:val="20"/>
                 <w:szCs w:val="20"/>
               </w:rPr>
-              <w:t xml:space="preserve">10.70.160.200 – .254</w:t>
-            </w:r>
-          </w:p>
-        </w:tc>
-        <w:tc>
-          <w:tcPr>
-            <w:tcW w:type="dxa" w:w="6360"/>
+              <w:t xml:space="preserve">192.168.161.1</w:t>
+            </w:r>
+          </w:p>
+        </w:tc>
+      </w:tr>
+      <w:tr>
+        <w:trPr>
+          <w:tblHeader w:val="off"/>
+        </w:trPr>
+        <w:tc>
+          <w:tcPr>
+            <w:tcW w:type="dxa" w:w="1950"/>
+            <w:tcMar>
+              <w:top w:type="dxa" w:w="60"/>
+              <w:left w:type="dxa" w:w="100"/>
+              <w:bottom w:type="dxa" w:w="60"/>
+              <w:right w:type="dxa" w:w="100"/>
+            </w:tcMar>
+          </w:tcPr>
+          <w:p>
+            <w:r>
+              <w:rPr>
+                <w:b w:val="false"/>
+                <w:bCs w:val="false"/>
+                <w:sz w:val="20"/>
+                <w:szCs w:val="20"/>
+              </w:rPr>
+              <w:t xml:space="preserve">Montréal (VIR-MTL)</w:t>
+            </w:r>
+          </w:p>
+        </w:tc>
+        <w:tc>
+          <w:tcPr>
+            <w:tcW w:type="dxa" w:w="2000"/>
+            <w:tcMar>
+              <w:top w:type="dxa" w:w="60"/>
+              <w:left w:type="dxa" w:w="100"/>
+              <w:bottom w:type="dxa" w:w="60"/>
+              <w:right w:type="dxa" w:w="100"/>
+            </w:tcMar>
+          </w:tcPr>
+          <w:p>
+            <w:r>
+              <w:rPr>
+                <w:b w:val="false"/>
+                <w:bCs w:val="false"/>
+                <w:sz w:val="20"/>
+                <w:szCs w:val="20"/>
+              </w:rPr>
+              <w:t xml:space="preserve">192.168.162.0/24</w:t>
+            </w:r>
+          </w:p>
+        </w:tc>
+        <w:tc>
+          <w:tcPr>
+            <w:tcW w:type="dxa" w:w="1850"/>
+            <w:tcMar>
+              <w:top w:type="dxa" w:w="60"/>
+              <w:left w:type="dxa" w:w="100"/>
+              <w:bottom w:type="dxa" w:w="60"/>
+              <w:right w:type="dxa" w:w="100"/>
+            </w:tcMar>
+          </w:tcPr>
+          <w:p>
+            <w:r>
+              <w:rPr>
+                <w:b w:val="false"/>
+                <w:bCs w:val="false"/>
+                <w:sz w:val="20"/>
+                <w:szCs w:val="20"/>
+              </w:rPr>
+              <w:t xml:space="preserve">255.255.255.0</w:t>
+            </w:r>
+          </w:p>
+        </w:tc>
+        <w:tc>
+          <w:tcPr>
+            <w:tcW w:type="dxa" w:w="1610"/>
+            <w:tcMar>
+              <w:top w:type="dxa" w:w="60"/>
+              <w:left w:type="dxa" w:w="100"/>
+              <w:bottom w:type="dxa" w:w="60"/>
+              <w:right w:type="dxa" w:w="100"/>
+            </w:tcMar>
+          </w:tcPr>
+          <w:p>
+            <w:r>
+              <w:rPr>
+                <w:b w:val="false"/>
+                <w:bCs w:val="false"/>
+                <w:sz w:val="20"/>
+                <w:szCs w:val="20"/>
+              </w:rPr>
+              <w:t xml:space="preserve">.1 à .254</w:t>
+            </w:r>
+          </w:p>
+        </w:tc>
+        <w:tc>
+          <w:tcPr>
+            <w:tcW w:type="dxa" w:w="1950"/>
+            <w:tcMar>
+              <w:top w:type="dxa" w:w="60"/>
+              <w:left w:type="dxa" w:w="100"/>
+              <w:bottom w:type="dxa" w:w="60"/>
+              <w:right w:type="dxa" w:w="100"/>
+            </w:tcMar>
+          </w:tcPr>
+          <w:p>
+            <w:r>
+              <w:rPr>
+                <w:b w:val="false"/>
+                <w:bCs w:val="false"/>
+                <w:sz w:val="20"/>
+                <w:szCs w:val="20"/>
+              </w:rPr>
+              <w:t xml:space="preserve">192.168.162.1</w:t>
+            </w:r>
+          </w:p>
+        </w:tc>
+      </w:tr>
+      <w:tr>
+        <w:trPr>
+          <w:tblHeader w:val="off"/>
+        </w:trPr>
+        <w:tc>
+          <w:tcPr>
+            <w:tcW w:type="dxa" w:w="1950"/>
             <w:shd w:fill="F3F6FA" w:color="auto" w:val="clear"/>
             <w:tcMar>
               <w:top w:type="dxa" w:w="60"/>
@@ -2395,12 +2915,347 @@
                 <w:sz w:val="20"/>
                 <w:szCs w:val="20"/>
               </w:rPr>
-              <w:t xml:space="preserve">Réservé aux tunnels VPN</w:t>
+              <w:t xml:space="preserve">Sherbrooke (VIR-SHE)</w:t>
+            </w:r>
+          </w:p>
+        </w:tc>
+        <w:tc>
+          <w:tcPr>
+            <w:tcW w:type="dxa" w:w="2000"/>
+            <w:shd w:fill="F3F6FA" w:color="auto" w:val="clear"/>
+            <w:tcMar>
+              <w:top w:type="dxa" w:w="60"/>
+              <w:left w:type="dxa" w:w="100"/>
+              <w:bottom w:type="dxa" w:w="60"/>
+              <w:right w:type="dxa" w:w="100"/>
+            </w:tcMar>
+          </w:tcPr>
+          <w:p>
+            <w:r>
+              <w:rPr>
+                <w:b w:val="false"/>
+                <w:bCs w:val="false"/>
+                <w:sz w:val="20"/>
+                <w:szCs w:val="20"/>
+              </w:rPr>
+              <w:t xml:space="preserve">192.168.163.0/24</w:t>
+            </w:r>
+          </w:p>
+        </w:tc>
+        <w:tc>
+          <w:tcPr>
+            <w:tcW w:type="dxa" w:w="1850"/>
+            <w:shd w:fill="F3F6FA" w:color="auto" w:val="clear"/>
+            <w:tcMar>
+              <w:top w:type="dxa" w:w="60"/>
+              <w:left w:type="dxa" w:w="100"/>
+              <w:bottom w:type="dxa" w:w="60"/>
+              <w:right w:type="dxa" w:w="100"/>
+            </w:tcMar>
+          </w:tcPr>
+          <w:p>
+            <w:r>
+              <w:rPr>
+                <w:b w:val="false"/>
+                <w:bCs w:val="false"/>
+                <w:sz w:val="20"/>
+                <w:szCs w:val="20"/>
+              </w:rPr>
+              <w:t xml:space="preserve">255.255.255.0</w:t>
+            </w:r>
+          </w:p>
+        </w:tc>
+        <w:tc>
+          <w:tcPr>
+            <w:tcW w:type="dxa" w:w="1610"/>
+            <w:shd w:fill="F3F6FA" w:color="auto" w:val="clear"/>
+            <w:tcMar>
+              <w:top w:type="dxa" w:w="60"/>
+              <w:left w:type="dxa" w:w="100"/>
+              <w:bottom w:type="dxa" w:w="60"/>
+              <w:right w:type="dxa" w:w="100"/>
+            </w:tcMar>
+          </w:tcPr>
+          <w:p>
+            <w:r>
+              <w:rPr>
+                <w:b w:val="false"/>
+                <w:bCs w:val="false"/>
+                <w:sz w:val="20"/>
+                <w:szCs w:val="20"/>
+              </w:rPr>
+              <w:t xml:space="preserve">.1 à .254</w:t>
+            </w:r>
+          </w:p>
+        </w:tc>
+        <w:tc>
+          <w:tcPr>
+            <w:tcW w:type="dxa" w:w="1950"/>
+            <w:shd w:fill="F3F6FA" w:color="auto" w:val="clear"/>
+            <w:tcMar>
+              <w:top w:type="dxa" w:w="60"/>
+              <w:left w:type="dxa" w:w="100"/>
+              <w:bottom w:type="dxa" w:w="60"/>
+              <w:right w:type="dxa" w:w="100"/>
+            </w:tcMar>
+          </w:tcPr>
+          <w:p>
+            <w:r>
+              <w:rPr>
+                <w:b w:val="false"/>
+                <w:bCs w:val="false"/>
+                <w:sz w:val="20"/>
+                <w:szCs w:val="20"/>
+              </w:rPr>
+              <w:t xml:space="preserve">192.168.163.1</w:t>
+            </w:r>
+          </w:p>
+        </w:tc>
+      </w:tr>
+      <w:tr>
+        <w:trPr>
+          <w:tblHeader w:val="off"/>
+        </w:trPr>
+        <w:tc>
+          <w:tcPr>
+            <w:tcW w:type="dxa" w:w="1950"/>
+            <w:tcMar>
+              <w:top w:type="dxa" w:w="60"/>
+              <w:left w:type="dxa" w:w="100"/>
+              <w:bottom w:type="dxa" w:w="60"/>
+              <w:right w:type="dxa" w:w="100"/>
+            </w:tcMar>
+          </w:tcPr>
+          <w:p>
+            <w:r>
+              <w:rPr>
+                <w:b w:val="false"/>
+                <w:bCs w:val="false"/>
+                <w:sz w:val="20"/>
+                <w:szCs w:val="20"/>
+              </w:rPr>
+              <w:t xml:space="preserve">Trois-Rivières (VIR-TR)</w:t>
+            </w:r>
+          </w:p>
+        </w:tc>
+        <w:tc>
+          <w:tcPr>
+            <w:tcW w:type="dxa" w:w="2000"/>
+            <w:tcMar>
+              <w:top w:type="dxa" w:w="60"/>
+              <w:left w:type="dxa" w:w="100"/>
+              <w:bottom w:type="dxa" w:w="60"/>
+              <w:right w:type="dxa" w:w="100"/>
+            </w:tcMar>
+          </w:tcPr>
+          <w:p>
+            <w:r>
+              <w:rPr>
+                <w:b w:val="false"/>
+                <w:bCs w:val="false"/>
+                <w:sz w:val="20"/>
+                <w:szCs w:val="20"/>
+              </w:rPr>
+              <w:t xml:space="preserve">192.168.164.0/24</w:t>
+            </w:r>
+          </w:p>
+        </w:tc>
+        <w:tc>
+          <w:tcPr>
+            <w:tcW w:type="dxa" w:w="1850"/>
+            <w:tcMar>
+              <w:top w:type="dxa" w:w="60"/>
+              <w:left w:type="dxa" w:w="100"/>
+              <w:bottom w:type="dxa" w:w="60"/>
+              <w:right w:type="dxa" w:w="100"/>
+            </w:tcMar>
+          </w:tcPr>
+          <w:p>
+            <w:r>
+              <w:rPr>
+                <w:b w:val="false"/>
+                <w:bCs w:val="false"/>
+                <w:sz w:val="20"/>
+                <w:szCs w:val="20"/>
+              </w:rPr>
+              <w:t xml:space="preserve">255.255.255.0</w:t>
+            </w:r>
+          </w:p>
+        </w:tc>
+        <w:tc>
+          <w:tcPr>
+            <w:tcW w:type="dxa" w:w="1610"/>
+            <w:tcMar>
+              <w:top w:type="dxa" w:w="60"/>
+              <w:left w:type="dxa" w:w="100"/>
+              <w:bottom w:type="dxa" w:w="60"/>
+              <w:right w:type="dxa" w:w="100"/>
+            </w:tcMar>
+          </w:tcPr>
+          <w:p>
+            <w:r>
+              <w:rPr>
+                <w:b w:val="false"/>
+                <w:bCs w:val="false"/>
+                <w:sz w:val="20"/>
+                <w:szCs w:val="20"/>
+              </w:rPr>
+              <w:t xml:space="preserve">.1 à .254</w:t>
+            </w:r>
+          </w:p>
+        </w:tc>
+        <w:tc>
+          <w:tcPr>
+            <w:tcW w:type="dxa" w:w="1950"/>
+            <w:tcMar>
+              <w:top w:type="dxa" w:w="60"/>
+              <w:left w:type="dxa" w:w="100"/>
+              <w:bottom w:type="dxa" w:w="60"/>
+              <w:right w:type="dxa" w:w="100"/>
+            </w:tcMar>
+          </w:tcPr>
+          <w:p>
+            <w:r>
+              <w:rPr>
+                <w:b w:val="false"/>
+                <w:bCs w:val="false"/>
+                <w:sz w:val="20"/>
+                <w:szCs w:val="20"/>
+              </w:rPr>
+              <w:t xml:space="preserve">192.168.164.1</w:t>
+            </w:r>
+          </w:p>
+        </w:tc>
+      </w:tr>
+      <w:tr>
+        <w:trPr>
+          <w:tblHeader w:val="off"/>
+        </w:trPr>
+        <w:tc>
+          <w:tcPr>
+            <w:tcW w:type="dxa" w:w="1950"/>
+            <w:shd w:fill="F3F6FA" w:color="auto" w:val="clear"/>
+            <w:tcMar>
+              <w:top w:type="dxa" w:w="60"/>
+              <w:left w:type="dxa" w:w="100"/>
+              <w:bottom w:type="dxa" w:w="60"/>
+              <w:right w:type="dxa" w:w="100"/>
+            </w:tcMar>
+          </w:tcPr>
+          <w:p>
+            <w:r>
+              <w:rPr>
+                <w:b w:val="false"/>
+                <w:bCs w:val="false"/>
+                <w:sz w:val="20"/>
+                <w:szCs w:val="20"/>
+              </w:rPr>
+              <w:t xml:space="preserve">WAN (réseau de l'école)</w:t>
+            </w:r>
+          </w:p>
+        </w:tc>
+        <w:tc>
+          <w:tcPr>
+            <w:tcW w:type="dxa" w:w="2000"/>
+            <w:shd w:fill="F3F6FA" w:color="auto" w:val="clear"/>
+            <w:tcMar>
+              <w:top w:type="dxa" w:w="60"/>
+              <w:left w:type="dxa" w:w="100"/>
+              <w:bottom w:type="dxa" w:w="60"/>
+              <w:right w:type="dxa" w:w="100"/>
+            </w:tcMar>
+          </w:tcPr>
+          <w:p>
+            <w:r>
+              <w:rPr>
+                <w:b w:val="false"/>
+                <w:bCs w:val="false"/>
+                <w:sz w:val="20"/>
+                <w:szCs w:val="20"/>
+              </w:rPr>
+              <w:t xml:space="preserve">10.70.0.0/16</w:t>
+            </w:r>
+          </w:p>
+        </w:tc>
+        <w:tc>
+          <w:tcPr>
+            <w:tcW w:type="dxa" w:w="1850"/>
+            <w:shd w:fill="F3F6FA" w:color="auto" w:val="clear"/>
+            <w:tcMar>
+              <w:top w:type="dxa" w:w="60"/>
+              <w:left w:type="dxa" w:w="100"/>
+              <w:bottom w:type="dxa" w:w="60"/>
+              <w:right w:type="dxa" w:w="100"/>
+            </w:tcMar>
+          </w:tcPr>
+          <w:p>
+            <w:r>
+              <w:rPr>
+                <w:b w:val="false"/>
+                <w:bCs w:val="false"/>
+                <w:sz w:val="20"/>
+                <w:szCs w:val="20"/>
+              </w:rPr>
+              <w:t xml:space="preserve">255.255.0.0</w:t>
+            </w:r>
+          </w:p>
+        </w:tc>
+        <w:tc>
+          <w:tcPr>
+            <w:tcW w:type="dxa" w:w="1610"/>
+            <w:shd w:fill="F3F6FA" w:color="auto" w:val="clear"/>
+            <w:tcMar>
+              <w:top w:type="dxa" w:w="60"/>
+              <w:left w:type="dxa" w:w="100"/>
+              <w:bottom w:type="dxa" w:w="60"/>
+              <w:right w:type="dxa" w:w="100"/>
+            </w:tcMar>
+          </w:tcPr>
+          <w:p>
+            <w:r>
+              <w:rPr>
+                <w:b w:val="false"/>
+                <w:bCs w:val="false"/>
+                <w:sz w:val="20"/>
+                <w:szCs w:val="20"/>
+              </w:rPr>
+              <w:t xml:space="preserve">10.70.0.1 à .255.254</w:t>
+            </w:r>
+          </w:p>
+        </w:tc>
+        <w:tc>
+          <w:tcPr>
+            <w:tcW w:type="dxa" w:w="1950"/>
+            <w:shd w:fill="F3F6FA" w:color="auto" w:val="clear"/>
+            <w:tcMar>
+              <w:top w:type="dxa" w:w="60"/>
+              <w:left w:type="dxa" w:w="100"/>
+              <w:bottom w:type="dxa" w:w="60"/>
+              <w:right w:type="dxa" w:w="100"/>
+            </w:tcMar>
+          </w:tcPr>
+          <w:p>
+            <w:r>
+              <w:rPr>
+                <w:b w:val="false"/>
+                <w:bCs w:val="false"/>
+                <w:sz w:val="20"/>
+                <w:szCs w:val="20"/>
+              </w:rPr>
+              <w:t xml:space="preserve">DHCP de l'école</w:t>
             </w:r>
           </w:p>
         </w:tc>
       </w:tr>
     </w:tbl>
+    <w:p>
+      <w:pPr>
+        <w:spacing w:before="120"/>
+      </w:pPr>
+      <w:r>
+        <w:t xml:space="preserve">Le DHCP de pfSense distribue 192.168.161.50 à 192.168.161.200 aux postes de travail du siège.</w:t>
+      </w:r>
+    </w:p>
     <w:p>
       <w:pPr>
         <w:pStyle w:val="Heading2"/>
@@ -2549,7 +3404,7 @@
                 <w:sz w:val="20"/>
                 <w:szCs w:val="20"/>
               </w:rPr>
-              <w:t xml:space="preserve">pfSense : routeur, pare-feu, DHCP, VPN</w:t>
+              <w:t xml:space="preserve">pfSense : routeur, pare-feu, DHCP, VPN IPsec</w:t>
             </w:r>
           </w:p>
         </w:tc>
@@ -2571,7 +3426,7 @@
                 <w:sz w:val="20"/>
                 <w:szCs w:val="20"/>
               </w:rPr>
-              <w:t xml:space="preserve">[à compléter]</w:t>
+              <w:t xml:space="preserve">LAN 192.168.161.1 · WAN DHCP 10.70.x.x</w:t>
             </w:r>
           </w:p>
         </w:tc>
@@ -2645,7 +3500,7 @@
                 <w:sz w:val="20"/>
                 <w:szCs w:val="20"/>
               </w:rPr>
-              <w:t xml:space="preserve">10.70.160.10</w:t>
+              <w:t xml:space="preserve">192.168.161.10</w:t>
             </w:r>
           </w:p>
         </w:tc>
@@ -2672,7 +3527,7 @@
                 <w:sz w:val="20"/>
                 <w:szCs w:val="20"/>
               </w:rPr>
-              <w:t xml:space="preserve">VIR-QC-NAS-01</w:t>
+              <w:t xml:space="preserve">VIR-QC-DNS-01</w:t>
             </w:r>
           </w:p>
         </w:tc>
@@ -2694,7 +3549,7 @@
                 <w:sz w:val="20"/>
                 <w:szCs w:val="20"/>
               </w:rPr>
-              <w:t xml:space="preserve">TrueNAS : stockage NFS / SMB</w:t>
+              <w:t xml:space="preserve">DNS secondaire (BIND9)</w:t>
             </w:r>
           </w:p>
         </w:tc>
@@ -2716,7 +3571,7 @@
                 <w:sz w:val="20"/>
                 <w:szCs w:val="20"/>
               </w:rPr>
-              <w:t xml:space="preserve">[à compléter]</w:t>
+              <w:t xml:space="preserve">192.168.161.11</w:t>
             </w:r>
           </w:p>
         </w:tc>
@@ -2744,7 +3599,7 @@
                 <w:sz w:val="20"/>
                 <w:szCs w:val="20"/>
               </w:rPr>
-              <w:t xml:space="preserve">VIR-QC-NC-01</w:t>
+              <w:t xml:space="preserve">VIR-QC-NAS-01</w:t>
             </w:r>
           </w:p>
         </w:tc>
@@ -2767,7 +3622,7 @@
                 <w:sz w:val="20"/>
                 <w:szCs w:val="20"/>
               </w:rPr>
-              <w:t xml:space="preserve">NextCloud (conteneur)</w:t>
+              <w:t xml:space="preserve">TrueNAS : stockage NFS / SMB</w:t>
             </w:r>
           </w:p>
         </w:tc>
@@ -2790,7 +3645,7 @@
                 <w:sz w:val="20"/>
                 <w:szCs w:val="20"/>
               </w:rPr>
-              <w:t xml:space="preserve">[à compléter]</w:t>
+              <w:t xml:space="preserve">192.168.161.12</w:t>
             </w:r>
           </w:p>
         </w:tc>
@@ -2817,7 +3672,7 @@
                 <w:sz w:val="20"/>
                 <w:szCs w:val="20"/>
               </w:rPr>
-              <w:t xml:space="preserve">VIR-QC-MON-01</w:t>
+              <w:t xml:space="preserve">VIR-QC-WEB-01</w:t>
             </w:r>
           </w:p>
         </w:tc>
@@ -2839,7 +3694,7 @@
                 <w:sz w:val="20"/>
                 <w:szCs w:val="20"/>
               </w:rPr>
-              <w:t xml:space="preserve">Supervision (conteneur)</w:t>
+              <w:t xml:space="preserve">Site Web (nginx + HTTPS)</w:t>
             </w:r>
           </w:p>
         </w:tc>
@@ -2861,7 +3716,7 @@
                 <w:sz w:val="20"/>
                 <w:szCs w:val="20"/>
               </w:rPr>
-              <w:t xml:space="preserve">[à compléter]</w:t>
+              <w:t xml:space="preserve">192.168.161.13</w:t>
             </w:r>
           </w:p>
         </w:tc>
@@ -2889,7 +3744,7 @@
                 <w:sz w:val="20"/>
                 <w:szCs w:val="20"/>
               </w:rPr>
-              <w:t xml:space="preserve">VIR-QC-WEB-01</w:t>
+              <w:t xml:space="preserve">VIR-QC-MON-01</w:t>
             </w:r>
           </w:p>
         </w:tc>
@@ -2912,7 +3767,7 @@
                 <w:sz w:val="20"/>
                 <w:szCs w:val="20"/>
               </w:rPr>
-              <w:t xml:space="preserve">Site Web HTTPS (conteneur)</w:t>
+              <w:t xml:space="preserve">Supervision</w:t>
             </w:r>
           </w:p>
         </w:tc>
@@ -2935,7 +3790,7 @@
                 <w:sz w:val="20"/>
                 <w:szCs w:val="20"/>
               </w:rPr>
-              <w:t xml:space="preserve">[à compléter]</w:t>
+              <w:t xml:space="preserve">192.168.161.14</w:t>
             </w:r>
           </w:p>
         </w:tc>
@@ -2962,7 +3817,7 @@
                 <w:sz w:val="20"/>
                 <w:szCs w:val="20"/>
               </w:rPr>
-              <w:t xml:space="preserve">VIR-QC-ANS-01</w:t>
+              <w:t xml:space="preserve">VIR-QC-NC-01</w:t>
             </w:r>
           </w:p>
         </w:tc>
@@ -2984,7 +3839,7 @@
                 <w:sz w:val="20"/>
                 <w:szCs w:val="20"/>
               </w:rPr>
-              <w:t xml:space="preserve">Ansible</w:t>
+              <w:t xml:space="preserve">NextCloud</w:t>
             </w:r>
           </w:p>
         </w:tc>
@@ -3006,7 +3861,7 @@
                 <w:sz w:val="20"/>
                 <w:szCs w:val="20"/>
               </w:rPr>
-              <w:t xml:space="preserve">[à compléter]</w:t>
+              <w:t xml:space="preserve">192.168.161.15</w:t>
             </w:r>
           </w:p>
         </w:tc>
@@ -3034,7 +3889,7 @@
                 <w:sz w:val="20"/>
                 <w:szCs w:val="20"/>
               </w:rPr>
-              <w:t xml:space="preserve">VIR-QC-WS-01</w:t>
+              <w:t xml:space="preserve">VIR-QC-ANS-01</w:t>
             </w:r>
           </w:p>
         </w:tc>
@@ -3057,7 +3912,7 @@
                 <w:sz w:val="20"/>
                 <w:szCs w:val="20"/>
               </w:rPr>
-              <w:t xml:space="preserve">Poste Windows 11</w:t>
+              <w:t xml:space="preserve">Ansible</w:t>
             </w:r>
           </w:p>
         </w:tc>
@@ -3080,107 +3935,302 @@
                 <w:sz w:val="20"/>
                 <w:szCs w:val="20"/>
               </w:rPr>
-              <w:t xml:space="preserve">DHCP</w:t>
+              <w:t xml:space="preserve">192.168.161.16</w:t>
+            </w:r>
+          </w:p>
+        </w:tc>
+      </w:tr>
+      <w:tr>
+        <w:trPr>
+          <w:tblHeader w:val="off"/>
+        </w:trPr>
+        <w:tc>
+          <w:tcPr>
+            <w:tcW w:type="dxa" w:w="2600"/>
+            <w:tcMar>
+              <w:top w:type="dxa" w:w="60"/>
+              <w:left w:type="dxa" w:w="100"/>
+              <w:bottom w:type="dxa" w:w="60"/>
+              <w:right w:type="dxa" w:w="100"/>
+            </w:tcMar>
+          </w:tcPr>
+          <w:p>
+            <w:r>
+              <w:rPr>
+                <w:b w:val="false"/>
+                <w:bCs w:val="false"/>
+                <w:sz w:val="20"/>
+                <w:szCs w:val="20"/>
+              </w:rPr>
+              <w:t xml:space="preserve">VIR-QC-WS-01</w:t>
+            </w:r>
+          </w:p>
+        </w:tc>
+        <w:tc>
+          <w:tcPr>
+            <w:tcW w:type="dxa" w:w="4360"/>
+            <w:tcMar>
+              <w:top w:type="dxa" w:w="60"/>
+              <w:left w:type="dxa" w:w="100"/>
+              <w:bottom w:type="dxa" w:w="60"/>
+              <w:right w:type="dxa" w:w="100"/>
+            </w:tcMar>
+          </w:tcPr>
+          <w:p>
+            <w:r>
+              <w:rPr>
+                <w:b w:val="false"/>
+                <w:bCs w:val="false"/>
+                <w:sz w:val="20"/>
+                <w:szCs w:val="20"/>
+              </w:rPr>
+              <w:t xml:space="preserve">Poste Windows 11</w:t>
+            </w:r>
+          </w:p>
+        </w:tc>
+        <w:tc>
+          <w:tcPr>
+            <w:tcW w:type="dxa" w:w="2400"/>
+            <w:tcMar>
+              <w:top w:type="dxa" w:w="60"/>
+              <w:left w:type="dxa" w:w="100"/>
+              <w:bottom w:type="dxa" w:w="60"/>
+              <w:right w:type="dxa" w:w="100"/>
+            </w:tcMar>
+          </w:tcPr>
+          <w:p>
+            <w:r>
+              <w:rPr>
+                <w:b w:val="false"/>
+                <w:bCs w:val="false"/>
+                <w:sz w:val="20"/>
+                <w:szCs w:val="20"/>
+              </w:rPr>
+              <w:t xml:space="preserve">DHCP (ex. 192.168.161.50)</w:t>
+            </w:r>
+          </w:p>
+        </w:tc>
+      </w:tr>
+      <w:tr>
+        <w:trPr>
+          <w:tblHeader w:val="off"/>
+        </w:trPr>
+        <w:tc>
+          <w:tcPr>
+            <w:tcW w:type="dxa" w:w="2600"/>
+            <w:shd w:fill="F3F6FA" w:color="auto" w:val="clear"/>
+            <w:tcMar>
+              <w:top w:type="dxa" w:w="60"/>
+              <w:left w:type="dxa" w:w="100"/>
+              <w:bottom w:type="dxa" w:w="60"/>
+              <w:right w:type="dxa" w:w="100"/>
+            </w:tcMar>
+          </w:tcPr>
+          <w:p>
+            <w:r>
+              <w:rPr>
+                <w:b w:val="false"/>
+                <w:bCs w:val="false"/>
+                <w:sz w:val="20"/>
+                <w:szCs w:val="20"/>
+              </w:rPr>
+              <w:t xml:space="preserve">VIR-MTL-FW-01</w:t>
+            </w:r>
+          </w:p>
+        </w:tc>
+        <w:tc>
+          <w:tcPr>
+            <w:tcW w:type="dxa" w:w="4360"/>
+            <w:shd w:fill="F3F6FA" w:color="auto" w:val="clear"/>
+            <w:tcMar>
+              <w:top w:type="dxa" w:w="60"/>
+              <w:left w:type="dxa" w:w="100"/>
+              <w:bottom w:type="dxa" w:w="60"/>
+              <w:right w:type="dxa" w:w="100"/>
+            </w:tcMar>
+          </w:tcPr>
+          <w:p>
+            <w:r>
+              <w:rPr>
+                <w:b w:val="false"/>
+                <w:bCs w:val="false"/>
+                <w:sz w:val="20"/>
+                <w:szCs w:val="20"/>
+              </w:rPr>
+              <w:t xml:space="preserve">pfSense de Montréal (VPN IPsec)</w:t>
+            </w:r>
+          </w:p>
+        </w:tc>
+        <w:tc>
+          <w:tcPr>
+            <w:tcW w:type="dxa" w:w="2400"/>
+            <w:shd w:fill="F3F6FA" w:color="auto" w:val="clear"/>
+            <w:tcMar>
+              <w:top w:type="dxa" w:w="60"/>
+              <w:left w:type="dxa" w:w="100"/>
+              <w:bottom w:type="dxa" w:w="60"/>
+              <w:right w:type="dxa" w:w="100"/>
+            </w:tcMar>
+          </w:tcPr>
+          <w:p>
+            <w:r>
+              <w:rPr>
+                <w:b w:val="false"/>
+                <w:bCs w:val="false"/>
+                <w:sz w:val="20"/>
+                <w:szCs w:val="20"/>
+              </w:rPr>
+              <w:t xml:space="preserve">192.168.162.1</w:t>
+            </w:r>
+          </w:p>
+        </w:tc>
+      </w:tr>
+      <w:tr>
+        <w:trPr>
+          <w:tblHeader w:val="off"/>
+        </w:trPr>
+        <w:tc>
+          <w:tcPr>
+            <w:tcW w:type="dxa" w:w="2600"/>
+            <w:tcMar>
+              <w:top w:type="dxa" w:w="60"/>
+              <w:left w:type="dxa" w:w="100"/>
+              <w:bottom w:type="dxa" w:w="60"/>
+              <w:right w:type="dxa" w:w="100"/>
+            </w:tcMar>
+          </w:tcPr>
+          <w:p>
+            <w:r>
+              <w:rPr>
+                <w:b w:val="false"/>
+                <w:bCs w:val="false"/>
+                <w:sz w:val="20"/>
+                <w:szCs w:val="20"/>
+              </w:rPr>
+              <w:t xml:space="preserve">VIR-MTL-DC-01</w:t>
+            </w:r>
+          </w:p>
+        </w:tc>
+        <w:tc>
+          <w:tcPr>
+            <w:tcW w:type="dxa" w:w="4360"/>
+            <w:tcMar>
+              <w:top w:type="dxa" w:w="60"/>
+              <w:left w:type="dxa" w:w="100"/>
+              <w:bottom w:type="dxa" w:w="60"/>
+              <w:right w:type="dxa" w:w="100"/>
+            </w:tcMar>
+          </w:tcPr>
+          <w:p>
+            <w:r>
+              <w:rPr>
+                <w:b w:val="false"/>
+                <w:bCs w:val="false"/>
+                <w:sz w:val="20"/>
+                <w:szCs w:val="20"/>
+              </w:rPr>
+              <w:t xml:space="preserve">AD (DC) de Montréal</w:t>
+            </w:r>
+          </w:p>
+        </w:tc>
+        <w:tc>
+          <w:tcPr>
+            <w:tcW w:type="dxa" w:w="2400"/>
+            <w:tcMar>
+              <w:top w:type="dxa" w:w="60"/>
+              <w:left w:type="dxa" w:w="100"/>
+              <w:bottom w:type="dxa" w:w="60"/>
+              <w:right w:type="dxa" w:w="100"/>
+            </w:tcMar>
+          </w:tcPr>
+          <w:p>
+            <w:r>
+              <w:rPr>
+                <w:b w:val="false"/>
+                <w:bCs w:val="false"/>
+                <w:sz w:val="20"/>
+                <w:szCs w:val="20"/>
+              </w:rPr>
+              <w:t xml:space="preserve">192.168.162.10</w:t>
+            </w:r>
+          </w:p>
+        </w:tc>
+      </w:tr>
+      <w:tr>
+        <w:trPr>
+          <w:tblHeader w:val="off"/>
+        </w:trPr>
+        <w:tc>
+          <w:tcPr>
+            <w:tcW w:type="dxa" w:w="2600"/>
+            <w:shd w:fill="F3F6FA" w:color="auto" w:val="clear"/>
+            <w:tcMar>
+              <w:top w:type="dxa" w:w="60"/>
+              <w:left w:type="dxa" w:w="100"/>
+              <w:bottom w:type="dxa" w:w="60"/>
+              <w:right w:type="dxa" w:w="100"/>
+            </w:tcMar>
+          </w:tcPr>
+          <w:p>
+            <w:r>
+              <w:rPr>
+                <w:b w:val="false"/>
+                <w:bCs w:val="false"/>
+                <w:sz w:val="20"/>
+                <w:szCs w:val="20"/>
+              </w:rPr>
+              <w:t xml:space="preserve">VIR-MTL-DNS-01</w:t>
+            </w:r>
+          </w:p>
+        </w:tc>
+        <w:tc>
+          <w:tcPr>
+            <w:tcW w:type="dxa" w:w="4360"/>
+            <w:shd w:fill="F3F6FA" w:color="auto" w:val="clear"/>
+            <w:tcMar>
+              <w:top w:type="dxa" w:w="60"/>
+              <w:left w:type="dxa" w:w="100"/>
+              <w:bottom w:type="dxa" w:w="60"/>
+              <w:right w:type="dxa" w:w="100"/>
+            </w:tcMar>
+          </w:tcPr>
+          <w:p>
+            <w:r>
+              <w:rPr>
+                <w:b w:val="false"/>
+                <w:bCs w:val="false"/>
+                <w:sz w:val="20"/>
+                <w:szCs w:val="20"/>
+              </w:rPr>
+              <w:t xml:space="preserve">DNS secondaire de Montréal</w:t>
+            </w:r>
+          </w:p>
+        </w:tc>
+        <w:tc>
+          <w:tcPr>
+            <w:tcW w:type="dxa" w:w="2400"/>
+            <w:shd w:fill="F3F6FA" w:color="auto" w:val="clear"/>
+            <w:tcMar>
+              <w:top w:type="dxa" w:w="60"/>
+              <w:left w:type="dxa" w:w="100"/>
+              <w:bottom w:type="dxa" w:w="60"/>
+              <w:right w:type="dxa" w:w="100"/>
+            </w:tcMar>
+          </w:tcPr>
+          <w:p>
+            <w:r>
+              <w:rPr>
+                <w:b w:val="false"/>
+                <w:bCs w:val="false"/>
+                <w:sz w:val="20"/>
+                <w:szCs w:val="20"/>
+              </w:rPr>
+              <w:t xml:space="preserve">192.168.162.11</w:t>
             </w:r>
           </w:p>
         </w:tc>
       </w:tr>
     </w:tbl>
-    <w:p>
-      <w:pPr>
-        <w:spacing w:after="0" w:before="120"/>
-      </w:pPr>
-    </w:p>
-    <w:tbl>
-      <w:tblPr>
-        <w:tblW w:type="dxa" w:w="9360"/>
-        <w:tblBorders>
-          <w:top w:val="single" w:color="auto" w:sz="4"/>
-          <w:left w:val="single" w:color="auto" w:sz="4"/>
-          <w:bottom w:val="single" w:color="auto" w:sz="4"/>
-          <w:right w:val="single" w:color="auto" w:sz="4"/>
-          <w:insideH w:val="single" w:color="auto" w:sz="4"/>
-          <w:insideV w:val="single" w:color="auto" w:sz="4"/>
-        </w:tblBorders>
-      </w:tblPr>
-      <w:tblGrid>
-        <w:gridCol w:w="9360"/>
-      </w:tblGrid>
-      <w:tr>
-        <w:trPr>
-          <w:trHeight w:val="2600" w:hRule="atLeast"/>
-        </w:trPr>
-        <w:tc>
-          <w:tcPr>
-            <w:tcW w:type="dxa" w:w="9360"/>
-            <w:tcBorders>
-              <w:top w:val="dashed" w:color="8EA9C8" w:sz="6"/>
-              <w:left w:val="dashed" w:color="8EA9C8" w:sz="6"/>
-              <w:bottom w:val="dashed" w:color="8EA9C8" w:sz="6"/>
-              <w:right w:val="dashed" w:color="8EA9C8" w:sz="6"/>
-            </w:tcBorders>
-            <w:shd w:fill="F7F9FC" w:color="auto" w:val="clear"/>
-            <w:vAlign w:val="center"/>
-          </w:tcPr>
-          <w:p>
-            <w:pPr>
-              <w:jc w:val="center"/>
-            </w:pPr>
-            <w:r>
-              <w:rPr>
-                <w:b/>
-                <w:bCs/>
-                <w:color w:val="808080"/>
-              </w:rPr>
-              <w:t xml:space="preserve">Insérer la capture 1 ici</w:t>
-            </w:r>
-          </w:p>
-          <w:p>
-            <w:pPr>
-              <w:jc w:val="center"/>
-            </w:pPr>
-            <w:r>
-              <w:rPr>
-                <w:color w:val="808080"/>
-                <w:sz w:val="20"/>
-                <w:szCs w:val="20"/>
-              </w:rPr>
-              <w:t xml:space="preserve">Schéma réseau de l'infrastructure (siège et succursales)</w:t>
-            </w:r>
-          </w:p>
-        </w:tc>
-      </w:tr>
-    </w:tbl>
-    <w:p>
-      <w:pPr>
-        <w:spacing w:after="60" w:before="80"/>
-        <w:jc w:val="center"/>
-      </w:pPr>
-      <w:r>
-        <w:rPr>
-          <w:i/>
-          <w:iCs/>
-          <w:sz w:val="20"/>
-          <w:szCs w:val="20"/>
-        </w:rPr>
-        <w:t xml:space="preserve">Figure 1 — Schéma réseau de l'infrastructure (siège et succursales)</w:t>
-      </w:r>
-    </w:p>
-    <w:p>
-      <w:pPr>
-        <w:spacing w:after="200"/>
-      </w:pPr>
-      <w:r>
-        <w:rPr>
-          <w:b/>
-          <w:bCs/>
-        </w:rPr>
-        <w:t xml:space="preserve">Commentaire : </w:t>
-      </w:r>
-      <w:r>
-        <w:t xml:space="preserve">cette capture montre l'ensemble des équipements, des ponts vmbr0 / vmbr1, de pfSense et des tunnels VPN vers les succursales.</w:t>
-      </w:r>
-    </w:p>
     <w:p>
       <w:pPr>
         <w:pStyle w:val="Heading1"/>
@@ -4290,7 +5340,7 @@
         <w:spacing w:after="60"/>
       </w:pPr>
       <w:r>
-        <w:t xml:space="preserve">Adresse de gestion 192.168.160.2/24, passerelle 192.168.160.1, DNS 192.168.160.10.</w:t>
+        <w:t xml:space="preserve">Adresse de gestion 192.168.160.2/24 (réseau de gestion 192.168.160.0/24), passerelle 192.168.160.1.</w:t>
       </w:r>
     </w:p>
     <w:p>
@@ -6088,7 +7138,7 @@
         <w:t xml:space="preserve">Objectif : </w:t>
       </w:r>
       <w:r>
-        <w:t xml:space="preserve">installer le routeur pare-feu qui relie le réseau des machines virtuelles au réseau du laboratoire.</w:t>
+        <w:t xml:space="preserve">installer le routeur pare-feu qui relie le réseau du siège (192.168.161.0/24) au réseau de l'école (10.70.0.0/16).</w:t>
       </w:r>
     </w:p>
     <w:p>
@@ -6122,7 +7172,7 @@
         <w:spacing w:after="60"/>
       </w:pPr>
       <w:r>
-        <w:t xml:space="preserve">Assignation des interfaces WAN et LAN et adressage du LAN.</w:t>
+        <w:t xml:space="preserve">Assignation des interfaces : WAN en DHCP sur le réseau de l'école (10.70.x.x/16), LAN 192.168.161.1/24.</w:t>
       </w:r>
     </w:p>
     <w:p>
@@ -6482,7 +7532,7 @@
         <w:spacing w:after="60"/>
       </w:pPr>
       <w:r>
-        <w:t xml:space="preserve">Services → DHCP Server : plage 192.168.160.100 à 192.168.160.200, passerelle .1, DNS 10.70.160.10.</w:t>
+        <w:t xml:space="preserve">Services → DHCP Server → LAN : plage 192.168.161.50 à 192.168.161.200, passerelle 192.168.161.1, DNS 192.168.161.10 (VIR-QC-DC-01).</w:t>
       </w:r>
     </w:p>
     <w:p>
@@ -6495,7 +7545,20 @@
         <w:spacing w:after="60"/>
       </w:pPr>
       <w:r>
-        <w:t xml:space="preserve">Test depuis une VM Windows sur vmbr1.</w:t>
+        <w:t xml:space="preserve">Les serveurs gardent une adresse fixe (192.168.161.10 à .16) hors de la plage.</w:t>
+      </w:r>
+    </w:p>
+    <w:p>
+      <w:pPr>
+        <w:pStyle w:val="ListParagraph"/>
+        <w:numPr>
+          <w:ilvl w:val="0"/>
+          <w:numId w:val="2"/>
+        </w:numPr>
+        <w:spacing w:after="60"/>
+      </w:pPr>
+      <w:r>
+        <w:t xml:space="preserve">Test depuis le poste VIR-QC-WS-01 (Windows 11) sur vmbr1.</w:t>
       </w:r>
     </w:p>
     <w:p>
@@ -6597,7 +7660,7 @@
         <w:spacing w:after="120"/>
       </w:pPr>
       <w:r>
-        <w:t xml:space="preserve">La VM obtient une adresse de la plage, le serveur DHCP indiqué est pfSense et tracert montre pfSense comme premier saut.</w:t>
+        <w:t xml:space="preserve">Le poste obtient une adresse entre 192.168.161.50 et .200 (par exemple 192.168.161.50), le serveur DHCP indiqué est 192.168.161.1 (pfSense) et tracert montre pfSense comme premier saut.</w:t>
       </w:r>
     </w:p>
     <w:p>
@@ -6836,7 +7899,7 @@
         <w:t xml:space="preserve">Objectif : </w:t>
       </w:r>
       <w:r>
-        <w:t xml:space="preserve">relier les réseaux des succursales (MTL, SHE, TR) au siège par des tunnels chiffrés.</w:t>
+        <w:t xml:space="preserve">relier les réseaux des succursales au siège par des tunnels IPsec site à site : Montréal (192.168.162.0/24, partiellement déployée), Sherbrooke (192.168.163.0/24) et Trois-Rivières (192.168.164.0/24), planifiées.</w:t>
       </w:r>
     </w:p>
     <w:p>
@@ -6857,7 +7920,7 @@
         <w:spacing w:after="60"/>
       </w:pPr>
       <w:r>
-        <w:t xml:space="preserve">VPN → OpenVPN (ou IPsec) : un tunnel site à site par succursale.</w:t>
+        <w:t xml:space="preserve">VPN → IPsec : une phase 1 par succursale (pair = WAN du pfSense distant : VIR-MTL-FW-01, VIR-SHE-FW-01, VIR-TR-FW-01).</w:t>
       </w:r>
     </w:p>
     <w:p>
@@ -6870,7 +7933,7 @@
         <w:spacing w:after="60"/>
       </w:pPr>
       <w:r>
-        <w:t xml:space="preserve">Plage 10.70.160.200 à .254 réservée aux tunnels.</w:t>
+        <w:t xml:space="preserve">Phase 2 : réseau local 192.168.161.0/24 vers le LAN de la succursale.</w:t>
       </w:r>
     </w:p>
     <w:p>
@@ -6883,7 +7946,7 @@
         <w:spacing w:after="60"/>
       </w:pPr>
       <w:r>
-        <w:t xml:space="preserve">Règles de pare-feu WAN et OpenVPN.</w:t>
+        <w:t xml:space="preserve">Firewall → Rules → IPsec : autoriser le trafic entre les sites.</w:t>
       </w:r>
     </w:p>
     <w:p>
@@ -6909,7 +7972,7 @@
           <w:sz w:val="18"/>
           <w:szCs w:val="18"/>
         </w:rPr>
-        <w:t xml:space="preserve"># Depuis un poste distant, tunnel établi</w:t>
+        <w:t xml:space="preserve"># Depuis un poste du siège</w:t>
       </w:r>
     </w:p>
     <w:p>
@@ -6924,7 +7987,22 @@
           <w:sz w:val="18"/>
           <w:szCs w:val="18"/>
         </w:rPr>
-        <w:t xml:space="preserve">ipconfig</w:t>
+        <w:t xml:space="preserve">ping 192.168.162.1        # pfSense de Montréal</w:t>
+      </w:r>
+    </w:p>
+    <w:p>
+      <w:pPr>
+        <w:shd w:fill="F2F2F2" w:color="auto" w:val="clear"/>
+        <w:spacing w:after="0" w:line="260"/>
+        <w:ind w:left="120" w:right="120"/>
+      </w:pPr>
+      <w:r>
+        <w:rPr>
+          <w:rFonts w:ascii="Consolas" w:cs="Consolas" w:eastAsia="Consolas" w:hAnsi="Consolas"/>
+          <w:sz w:val="18"/>
+          <w:szCs w:val="18"/>
+        </w:rPr>
+        <w:t xml:space="preserve">ping 192.168.162.10       # VIR-MTL-DC-01</w:t>
       </w:r>
     </w:p>
     <w:p>
@@ -6939,7 +8017,7 @@
           <w:sz w:val="18"/>
           <w:szCs w:val="18"/>
         </w:rPr>
-        <w:t xml:space="preserve">ping &lt;IP d'une VM du siège&gt;</w:t>
+        <w:t xml:space="preserve">tracert 192.168.162.10</w:t>
       </w:r>
     </w:p>
     <w:p>
@@ -6955,7 +8033,7 @@
         <w:spacing w:after="120"/>
       </w:pPr>
       <w:r>
-        <w:t xml:space="preserve">Le tunnel est à l'état « up » dans Status → OpenVPN et les hôtes du siège répondent à travers le tunnel.</w:t>
+        <w:t xml:space="preserve">Le tunnel vers Montréal est « ESTABLISHED » dans Status → IPsec et les hôtes de la succursale répondent à travers le tunnel. Les tunnels de Sherbrooke et Trois-Rivières sont configurés en prévision de leur déploiement.</w:t>
       </w:r>
     </w:p>
     <w:p>
@@ -7041,7 +8119,7 @@
                 <w:sz w:val="20"/>
                 <w:szCs w:val="20"/>
               </w:rPr>
-              <w:t xml:space="preserve">Status → OpenVPN</w:t>
+              <w:t xml:space="preserve">Status → IPsec</w:t>
             </w:r>
           </w:p>
         </w:tc>
@@ -7059,7 +8137,7 @@
           <w:sz w:val="20"/>
           <w:szCs w:val="20"/>
         </w:rPr>
-        <w:t xml:space="preserve">Figure 17 — Status → OpenVPN</w:t>
+        <w:t xml:space="preserve">Figure 17 — Status → IPsec</w:t>
       </w:r>
     </w:p>
     <w:p>
@@ -7074,7 +8152,7 @@
         <w:t xml:space="preserve">Commentaire : </w:t>
       </w:r>
       <w:r>
-        <w:t xml:space="preserve">cette capture montre les tunnels établis.</w:t>
+        <w:t xml:space="preserve">cette capture montre les tunnels établis vers les succursales.</w:t>
       </w:r>
     </w:p>
     <w:p>
@@ -7249,7 +8327,7 @@
         <w:spacing w:after="60"/>
       </w:pPr>
       <w:r>
-        <w:t xml:space="preserve">Clone de TPL-WS2022, adresse 10.70.160.10, nom VIR-QC-DC-01.</w:t>
+        <w:t xml:space="preserve">Clone de TPL-WS2022, adresse 192.168.161.10, nom VIR-QC-DC-01.</w:t>
       </w:r>
     </w:p>
     <w:p>
@@ -9209,7 +10287,7 @@
         <w:spacing w:after="60"/>
       </w:pPr>
       <w:r>
-        <w:t xml:space="preserve">Zone secondaire (slave) BIND9 sur Debian dans chaque site.</w:t>
+        <w:t xml:space="preserve">Zone secondaire (slave) BIND9 sur VIR-QC-DNS-01 (192.168.161.11) au siège et sur un serveur DNS dans chaque succursale (ex. VIR-MTL-DNS-01, 192.168.162.11).</w:t>
       </w:r>
     </w:p>
     <w:p>

</xml_diff>

<commit_message>
Rapport final : adresses sans conflit (SW-01 en .160.4, poste admin VIR-QC-ADM-01, WB-01 en .161.17)
Co-Authored-By: Claude Opus 5.5 <noreply@anthropic.com>
Claude-Session: https://claude.ai/code/session_01H1sf4zDq3Hzk1M44xBfVAb
</commit_message>
<xml_diff>
--- a/rapport/Rapport_final_Equipe04.docx
+++ b/rapport/Rapport_final_Equipe04.docx
@@ -1782,7 +1782,7 @@
         <w:t xml:space="preserve">Commentaire : </w:t>
       </w:r>
       <w:r>
-        <w:t xml:space="preserve">au siège, le réseau de gestion (vmbr0, 192.168.160.0/24) relie Proxmox VE, PBS et le poste d'administration. Les machines virtuelles sont sur vmbr1 (192.168.161.0/24), derrière le pare-feu VIR-QC-FW-01, qui sort vers le réseau de l'école (10.70.0.0/16) et porte les tunnels IPsec vers les succursales.</w:t>
+        <w:t xml:space="preserve">au siège, le réseau de gestion (vmbr0, 192.168.160.0/24) relie Proxmox VE, PBS et le poste d'administration VIR-QC-ADM-01. Les machines virtuelles sont sur vmbr1 (192.168.161.0/24), derrière le pare-feu VIR-QC-FW-01, qui sort vers le réseau de l'école (10.70.0.0/16) et porte les tunnels IPsec vers les succursales.</w:t>
       </w:r>
     </w:p>
     <w:p>
@@ -2192,7 +2192,7 @@
                 <w:sz w:val="20"/>
                 <w:szCs w:val="20"/>
               </w:rPr>
-              <w:t xml:space="preserve">192.168.160.1</w:t>
+              <w:t xml:space="preserve">192.168.160.4</w:t>
             </w:r>
           </w:p>
         </w:tc>
@@ -2338,7 +2338,7 @@
                 <w:sz w:val="20"/>
                 <w:szCs w:val="20"/>
               </w:rPr>
-              <w:t xml:space="preserve">VIR-QC-WS-01</w:t>
+              <w:t xml:space="preserve">VIR-QC-ADM-01</w:t>
             </w:r>
           </w:p>
         </w:tc>
@@ -3889,7 +3889,7 @@
                 <w:sz w:val="20"/>
                 <w:szCs w:val="20"/>
               </w:rPr>
-              <w:t xml:space="preserve">VIR-QC-ANS-01</w:t>
+              <w:t xml:space="preserve">VIR-QC-WB-01</w:t>
             </w:r>
           </w:p>
         </w:tc>
@@ -3912,7 +3912,7 @@
                 <w:sz w:val="20"/>
                 <w:szCs w:val="20"/>
               </w:rPr>
-              <w:t xml:space="preserve">Ansible</w:t>
+              <w:t xml:space="preserve">Serveur Web secondaire (réservé)</w:t>
             </w:r>
           </w:p>
         </w:tc>
@@ -3935,7 +3935,7 @@
                 <w:sz w:val="20"/>
                 <w:szCs w:val="20"/>
               </w:rPr>
-              <w:t xml:space="preserve">192.168.161.16</w:t>
+              <w:t xml:space="preserve">192.168.161.17</w:t>
             </w:r>
           </w:p>
         </w:tc>
@@ -3962,7 +3962,7 @@
                 <w:sz w:val="20"/>
                 <w:szCs w:val="20"/>
               </w:rPr>
-              <w:t xml:space="preserve">VIR-QC-WS-01</w:t>
+              <w:t xml:space="preserve">VIR-QC-ANS-01</w:t>
             </w:r>
           </w:p>
         </w:tc>
@@ -3984,7 +3984,7 @@
                 <w:sz w:val="20"/>
                 <w:szCs w:val="20"/>
               </w:rPr>
-              <w:t xml:space="preserve">Poste Windows 11</w:t>
+              <w:t xml:space="preserve">Ansible</w:t>
             </w:r>
           </w:p>
         </w:tc>
@@ -4006,7 +4006,7 @@
                 <w:sz w:val="20"/>
                 <w:szCs w:val="20"/>
               </w:rPr>
-              <w:t xml:space="preserve">DHCP (ex. 192.168.161.50)</w:t>
+              <w:t xml:space="preserve">192.168.161.16</w:t>
             </w:r>
           </w:p>
         </w:tc>
@@ -4034,7 +4034,7 @@
                 <w:sz w:val="20"/>
                 <w:szCs w:val="20"/>
               </w:rPr>
-              <w:t xml:space="preserve">VIR-MTL-FW-01</w:t>
+              <w:t xml:space="preserve">VIR-QC-WS-01</w:t>
             </w:r>
           </w:p>
         </w:tc>
@@ -4057,7 +4057,7 @@
                 <w:sz w:val="20"/>
                 <w:szCs w:val="20"/>
               </w:rPr>
-              <w:t xml:space="preserve">pfSense de Montréal (VPN IPsec)</w:t>
+              <w:t xml:space="preserve">Poste Windows 11</w:t>
             </w:r>
           </w:p>
         </w:tc>
@@ -4080,7 +4080,7 @@
                 <w:sz w:val="20"/>
                 <w:szCs w:val="20"/>
               </w:rPr>
-              <w:t xml:space="preserve">192.168.162.1</w:t>
+              <w:t xml:space="preserve">DHCP (ex. 192.168.161.50)</w:t>
             </w:r>
           </w:p>
         </w:tc>
@@ -4107,7 +4107,7 @@
                 <w:sz w:val="20"/>
                 <w:szCs w:val="20"/>
               </w:rPr>
-              <w:t xml:space="preserve">VIR-MTL-DC-01</w:t>
+              <w:t xml:space="preserve">VIR-MTL-FW-01</w:t>
             </w:r>
           </w:p>
         </w:tc>
@@ -4129,7 +4129,7 @@
                 <w:sz w:val="20"/>
                 <w:szCs w:val="20"/>
               </w:rPr>
-              <w:t xml:space="preserve">AD (DC) de Montréal</w:t>
+              <w:t xml:space="preserve">pfSense de Montréal (VPN IPsec)</w:t>
             </w:r>
           </w:p>
         </w:tc>
@@ -4151,7 +4151,7 @@
                 <w:sz w:val="20"/>
                 <w:szCs w:val="20"/>
               </w:rPr>
-              <w:t xml:space="preserve">192.168.162.10</w:t>
+              <w:t xml:space="preserve">192.168.162.1</w:t>
             </w:r>
           </w:p>
         </w:tc>
@@ -4179,7 +4179,7 @@
                 <w:sz w:val="20"/>
                 <w:szCs w:val="20"/>
               </w:rPr>
-              <w:t xml:space="preserve">VIR-MTL-DNS-01</w:t>
+              <w:t xml:space="preserve">VIR-MTL-DC-01</w:t>
             </w:r>
           </w:p>
         </w:tc>
@@ -4202,7 +4202,7 @@
                 <w:sz w:val="20"/>
                 <w:szCs w:val="20"/>
               </w:rPr>
-              <w:t xml:space="preserve">DNS secondaire de Montréal</w:t>
+              <w:t xml:space="preserve">AD (DC) de Montréal</w:t>
             </w:r>
           </w:p>
         </w:tc>
@@ -4210,6 +4210,77 @@
           <w:tcPr>
             <w:tcW w:type="dxa" w:w="2400"/>
             <w:shd w:fill="F3F6FA" w:color="auto" w:val="clear"/>
+            <w:tcMar>
+              <w:top w:type="dxa" w:w="60"/>
+              <w:left w:type="dxa" w:w="100"/>
+              <w:bottom w:type="dxa" w:w="60"/>
+              <w:right w:type="dxa" w:w="100"/>
+            </w:tcMar>
+          </w:tcPr>
+          <w:p>
+            <w:r>
+              <w:rPr>
+                <w:b w:val="false"/>
+                <w:bCs w:val="false"/>
+                <w:sz w:val="20"/>
+                <w:szCs w:val="20"/>
+              </w:rPr>
+              <w:t xml:space="preserve">192.168.162.10</w:t>
+            </w:r>
+          </w:p>
+        </w:tc>
+      </w:tr>
+      <w:tr>
+        <w:trPr>
+          <w:tblHeader w:val="off"/>
+        </w:trPr>
+        <w:tc>
+          <w:tcPr>
+            <w:tcW w:type="dxa" w:w="2600"/>
+            <w:tcMar>
+              <w:top w:type="dxa" w:w="60"/>
+              <w:left w:type="dxa" w:w="100"/>
+              <w:bottom w:type="dxa" w:w="60"/>
+              <w:right w:type="dxa" w:w="100"/>
+            </w:tcMar>
+          </w:tcPr>
+          <w:p>
+            <w:r>
+              <w:rPr>
+                <w:b w:val="false"/>
+                <w:bCs w:val="false"/>
+                <w:sz w:val="20"/>
+                <w:szCs w:val="20"/>
+              </w:rPr>
+              <w:t xml:space="preserve">VIR-MTL-DNS-01</w:t>
+            </w:r>
+          </w:p>
+        </w:tc>
+        <w:tc>
+          <w:tcPr>
+            <w:tcW w:type="dxa" w:w="4360"/>
+            <w:tcMar>
+              <w:top w:type="dxa" w:w="60"/>
+              <w:left w:type="dxa" w:w="100"/>
+              <w:bottom w:type="dxa" w:w="60"/>
+              <w:right w:type="dxa" w:w="100"/>
+            </w:tcMar>
+          </w:tcPr>
+          <w:p>
+            <w:r>
+              <w:rPr>
+                <w:b w:val="false"/>
+                <w:bCs w:val="false"/>
+                <w:sz w:val="20"/>
+                <w:szCs w:val="20"/>
+              </w:rPr>
+              <w:t xml:space="preserve">DNS secondaire de Montréal</w:t>
+            </w:r>
+          </w:p>
+        </w:tc>
+        <w:tc>
+          <w:tcPr>
+            <w:tcW w:type="dxa" w:w="2400"/>
             <w:tcMar>
               <w:top w:type="dxa" w:w="60"/>
               <w:left w:type="dxa" w:w="100"/>

</xml_diff>

<commit_message>
Rapport final : membres de l'équipe 04 sur la couverture et dans les conclusions
Co-Authored-By: Claude Opus 5.5 <noreply@anthropic.com>
Claude-Session: https://claude.ai/code/session_01H1sf4zDq3Hzk1M44xBfVAb
</commit_message>
<xml_diff>
--- a/rapport/Rapport_final_Equipe04.docx
+++ b/rapport/Rapport_final_Equipe04.docx
@@ -122,7 +122,7 @@
           </w:tcPr>
           <w:p>
             <w:r>
-              <w:t xml:space="preserve">[Nom]</w:t>
+              <w:t xml:space="preserve">Vitaleme Celestin</w:t>
             </w:r>
           </w:p>
         </w:tc>
@@ -161,7 +161,7 @@
           </w:tcPr>
           <w:p>
             <w:r>
-              <w:t xml:space="preserve">[Nom 1], [Nom 2], [Nom 3], [Nom 4]</w:t>
+              <w:t xml:space="preserve">Vitaleme Celestin, Boris Rousseau Mbakam, Ricardo Martin Orbegoso Contreras</w:t>
             </w:r>
           </w:p>
         </w:tc>
@@ -337,7 +337,7 @@
             <w:szCs w:val="22"/>
           </w:rPr>
           <w:tab/>
-          <w:t xml:space="preserve">4</w:t>
+          <w:t xml:space="preserve">3</w:t>
         </w:r>
       </w:hyperlink>
     </w:p>
@@ -367,7 +367,7 @@
             <w:szCs w:val="22"/>
           </w:rPr>
           <w:tab/>
-          <w:t xml:space="preserve">5</w:t>
+          <w:t xml:space="preserve">4</w:t>
         </w:r>
       </w:hyperlink>
     </w:p>
@@ -397,7 +397,7 @@
             <w:szCs w:val="20"/>
           </w:rPr>
           <w:tab/>
-          <w:t xml:space="preserve">5</w:t>
+          <w:t xml:space="preserve">4</w:t>
         </w:r>
       </w:hyperlink>
     </w:p>
@@ -427,7 +427,7 @@
             <w:szCs w:val="20"/>
           </w:rPr>
           <w:tab/>
-          <w:t xml:space="preserve">6</w:t>
+          <w:t xml:space="preserve">5</w:t>
         </w:r>
       </w:hyperlink>
     </w:p>
@@ -457,7 +457,7 @@
             <w:szCs w:val="20"/>
           </w:rPr>
           <w:tab/>
-          <w:t xml:space="preserve">6</w:t>
+          <w:t xml:space="preserve">5</w:t>
         </w:r>
       </w:hyperlink>
     </w:p>
@@ -487,7 +487,7 @@
             <w:szCs w:val="22"/>
           </w:rPr>
           <w:tab/>
-          <w:t xml:space="preserve">7</w:t>
+          <w:t xml:space="preserve">6</w:t>
         </w:r>
       </w:hyperlink>
     </w:p>
@@ -517,7 +517,7 @@
             <w:szCs w:val="20"/>
           </w:rPr>
           <w:tab/>
-          <w:t xml:space="preserve">7</w:t>
+          <w:t xml:space="preserve">6</w:t>
         </w:r>
       </w:hyperlink>
     </w:p>
@@ -547,7 +547,7 @@
             <w:szCs w:val="20"/>
           </w:rPr>
           <w:tab/>
-          <w:t xml:space="preserve">8</w:t>
+          <w:t xml:space="preserve">7</w:t>
         </w:r>
       </w:hyperlink>
     </w:p>
@@ -577,7 +577,7 @@
             <w:szCs w:val="20"/>
           </w:rPr>
           <w:tab/>
-          <w:t xml:space="preserve">9</w:t>
+          <w:t xml:space="preserve">8</w:t>
         </w:r>
       </w:hyperlink>
     </w:p>
@@ -607,7 +607,7 @@
             <w:szCs w:val="20"/>
           </w:rPr>
           <w:tab/>
-          <w:t xml:space="preserve">11</w:t>
+          <w:t xml:space="preserve">10</w:t>
         </w:r>
       </w:hyperlink>
     </w:p>
@@ -637,7 +637,7 @@
             <w:szCs w:val="20"/>
           </w:rPr>
           <w:tab/>
-          <w:t xml:space="preserve">11</w:t>
+          <w:t xml:space="preserve">10</w:t>
         </w:r>
       </w:hyperlink>
     </w:p>
@@ -667,7 +667,7 @@
             <w:szCs w:val="20"/>
           </w:rPr>
           <w:tab/>
-          <w:t xml:space="preserve">12</w:t>
+          <w:t xml:space="preserve">11</w:t>
         </w:r>
       </w:hyperlink>
     </w:p>
@@ -697,7 +697,7 @@
             <w:szCs w:val="20"/>
           </w:rPr>
           <w:tab/>
-          <w:t xml:space="preserve">14</w:t>
+          <w:t xml:space="preserve">13</w:t>
         </w:r>
       </w:hyperlink>
     </w:p>
@@ -727,7 +727,7 @@
             <w:szCs w:val="20"/>
           </w:rPr>
           <w:tab/>
-          <w:t xml:space="preserve">15</w:t>
+          <w:t xml:space="preserve">14</w:t>
         </w:r>
       </w:hyperlink>
     </w:p>
@@ -757,7 +757,7 @@
             <w:szCs w:val="20"/>
           </w:rPr>
           <w:tab/>
-          <w:t xml:space="preserve">16</w:t>
+          <w:t xml:space="preserve">15</w:t>
         </w:r>
       </w:hyperlink>
     </w:p>
@@ -787,7 +787,7 @@
             <w:szCs w:val="22"/>
           </w:rPr>
           <w:tab/>
-          <w:t xml:space="preserve">18</w:t>
+          <w:t xml:space="preserve">17</w:t>
         </w:r>
       </w:hyperlink>
     </w:p>
@@ -817,7 +817,7 @@
             <w:szCs w:val="20"/>
           </w:rPr>
           <w:tab/>
-          <w:t xml:space="preserve">18</w:t>
+          <w:t xml:space="preserve">17</w:t>
         </w:r>
       </w:hyperlink>
     </w:p>
@@ -847,7 +847,7 @@
             <w:szCs w:val="20"/>
           </w:rPr>
           <w:tab/>
-          <w:t xml:space="preserve">18</w:t>
+          <w:t xml:space="preserve">17</w:t>
         </w:r>
       </w:hyperlink>
     </w:p>
@@ -877,7 +877,7 @@
             <w:szCs w:val="20"/>
           </w:rPr>
           <w:tab/>
-          <w:t xml:space="preserve">20</w:t>
+          <w:t xml:space="preserve">19</w:t>
         </w:r>
       </w:hyperlink>
     </w:p>
@@ -907,7 +907,7 @@
             <w:szCs w:val="20"/>
           </w:rPr>
           <w:tab/>
-          <w:t xml:space="preserve">21</w:t>
+          <w:t xml:space="preserve">20</w:t>
         </w:r>
       </w:hyperlink>
     </w:p>
@@ -937,7 +937,7 @@
             <w:szCs w:val="20"/>
           </w:rPr>
           <w:tab/>
-          <w:t xml:space="preserve">22</w:t>
+          <w:t xml:space="preserve">21</w:t>
         </w:r>
       </w:hyperlink>
     </w:p>
@@ -967,7 +967,7 @@
             <w:szCs w:val="20"/>
           </w:rPr>
           <w:tab/>
-          <w:t xml:space="preserve">24</w:t>
+          <w:t xml:space="preserve">23</w:t>
         </w:r>
       </w:hyperlink>
     </w:p>
@@ -997,7 +997,7 @@
             <w:szCs w:val="20"/>
           </w:rPr>
           <w:tab/>
-          <w:t xml:space="preserve">25</w:t>
+          <w:t xml:space="preserve">24</w:t>
         </w:r>
       </w:hyperlink>
     </w:p>
@@ -1027,7 +1027,7 @@
             <w:szCs w:val="22"/>
           </w:rPr>
           <w:tab/>
-          <w:t xml:space="preserve">28</w:t>
+          <w:t xml:space="preserve">27</w:t>
         </w:r>
       </w:hyperlink>
     </w:p>
@@ -1057,7 +1057,7 @@
             <w:szCs w:val="20"/>
           </w:rPr>
           <w:tab/>
-          <w:t xml:space="preserve">28</w:t>
+          <w:t xml:space="preserve">27</w:t>
         </w:r>
       </w:hyperlink>
     </w:p>
@@ -1087,7 +1087,7 @@
             <w:szCs w:val="20"/>
           </w:rPr>
           <w:tab/>
-          <w:t xml:space="preserve">28</w:t>
+          <w:t xml:space="preserve">27</w:t>
         </w:r>
       </w:hyperlink>
     </w:p>
@@ -1117,7 +1117,7 @@
             <w:szCs w:val="20"/>
           </w:rPr>
           <w:tab/>
-          <w:t xml:space="preserve">29</w:t>
+          <w:t xml:space="preserve">28</w:t>
         </w:r>
       </w:hyperlink>
     </w:p>
@@ -1147,7 +1147,7 @@
             <w:szCs w:val="22"/>
           </w:rPr>
           <w:tab/>
-          <w:t xml:space="preserve">31</w:t>
+          <w:t xml:space="preserve">30</w:t>
         </w:r>
       </w:hyperlink>
     </w:p>
@@ -1177,7 +1177,7 @@
             <w:szCs w:val="20"/>
           </w:rPr>
           <w:tab/>
-          <w:t xml:space="preserve">31</w:t>
+          <w:t xml:space="preserve">30</w:t>
         </w:r>
       </w:hyperlink>
     </w:p>
@@ -1207,7 +1207,7 @@
             <w:szCs w:val="20"/>
           </w:rPr>
           <w:tab/>
-          <w:t xml:space="preserve">32</w:t>
+          <w:t xml:space="preserve">31</w:t>
         </w:r>
       </w:hyperlink>
     </w:p>
@@ -1237,7 +1237,7 @@
             <w:szCs w:val="20"/>
           </w:rPr>
           <w:tab/>
-          <w:t xml:space="preserve">33</w:t>
+          <w:t xml:space="preserve">32</w:t>
         </w:r>
       </w:hyperlink>
     </w:p>
@@ -1267,7 +1267,7 @@
             <w:szCs w:val="22"/>
           </w:rPr>
           <w:tab/>
-          <w:t xml:space="preserve">34</w:t>
+          <w:t xml:space="preserve">33</w:t>
         </w:r>
       </w:hyperlink>
     </w:p>
@@ -1297,7 +1297,7 @@
             <w:szCs w:val="20"/>
           </w:rPr>
           <w:tab/>
-          <w:t xml:space="preserve">34</w:t>
+          <w:t xml:space="preserve">33</w:t>
         </w:r>
       </w:hyperlink>
     </w:p>
@@ -1327,7 +1327,7 @@
             <w:szCs w:val="20"/>
           </w:rPr>
           <w:tab/>
-          <w:t xml:space="preserve">35</w:t>
+          <w:t xml:space="preserve">34</w:t>
         </w:r>
       </w:hyperlink>
     </w:p>
@@ -1357,7 +1357,7 @@
             <w:szCs w:val="20"/>
           </w:rPr>
           <w:tab/>
-          <w:t xml:space="preserve">36</w:t>
+          <w:t xml:space="preserve">35</w:t>
         </w:r>
       </w:hyperlink>
     </w:p>
@@ -1387,7 +1387,7 @@
             <w:szCs w:val="20"/>
           </w:rPr>
           <w:tab/>
-          <w:t xml:space="preserve">37</w:t>
+          <w:t xml:space="preserve">36</w:t>
         </w:r>
       </w:hyperlink>
     </w:p>
@@ -1417,7 +1417,7 @@
             <w:szCs w:val="22"/>
           </w:rPr>
           <w:tab/>
-          <w:t xml:space="preserve">39</w:t>
+          <w:t xml:space="preserve">38</w:t>
         </w:r>
       </w:hyperlink>
     </w:p>
@@ -1447,7 +1447,7 @@
             <w:szCs w:val="22"/>
           </w:rPr>
           <w:tab/>
-          <w:t xml:space="preserve">40</w:t>
+          <w:t xml:space="preserve">39</w:t>
         </w:r>
       </w:hyperlink>
     </w:p>
@@ -1467,7 +1467,7 @@
             <w:sz w:val="20"/>
             <w:szCs w:val="20"/>
           </w:rPr>
-          <w:t xml:space="preserve">Conclusion de [Nom 1]</w:t>
+          <w:t xml:space="preserve">Conclusion de Vitaleme Celestin</w:t>
         </w:r>
         <w:r>
           <w:rPr>
@@ -1477,7 +1477,7 @@
             <w:szCs w:val="20"/>
           </w:rPr>
           <w:tab/>
-          <w:t xml:space="preserve">40</w:t>
+          <w:t xml:space="preserve">39</w:t>
         </w:r>
       </w:hyperlink>
     </w:p>
@@ -1497,7 +1497,7 @@
             <w:sz w:val="20"/>
             <w:szCs w:val="20"/>
           </w:rPr>
-          <w:t xml:space="preserve">Conclusion de [Nom 2]</w:t>
+          <w:t xml:space="preserve">Conclusion de Boris Rousseau Mbakam</w:t>
         </w:r>
         <w:r>
           <w:rPr>
@@ -1507,7 +1507,7 @@
             <w:szCs w:val="20"/>
           </w:rPr>
           <w:tab/>
-          <w:t xml:space="preserve">40</w:t>
+          <w:t xml:space="preserve">39</w:t>
         </w:r>
       </w:hyperlink>
     </w:p>
@@ -1527,7 +1527,7 @@
             <w:sz w:val="20"/>
             <w:szCs w:val="20"/>
           </w:rPr>
-          <w:t xml:space="preserve">Conclusion de [Nom 3]</w:t>
+          <w:t xml:space="preserve">Conclusion de Ricardo Martin Orbegoso Contreras</w:t>
         </w:r>
         <w:r>
           <w:rPr>
@@ -1537,37 +1537,7 @@
             <w:szCs w:val="20"/>
           </w:rPr>
           <w:tab/>
-          <w:t xml:space="preserve">40</w:t>
-        </w:r>
-      </w:hyperlink>
-    </w:p>
-    <w:p>
-      <w:pPr>
-        <w:tabs>
-          <w:tab w:val="right" w:pos="9360" w:leader="dot"/>
-        </w:tabs>
-        <w:spacing w:after="20" w:before="20"/>
-        <w:ind w:left="360"/>
-      </w:pPr>
-      <w:hyperlink w:history="1" w:anchor="h41">
-        <w:r>
-          <w:rPr>
-            <w:b w:val="false"/>
-            <w:bCs w:val="false"/>
-            <w:sz w:val="20"/>
-            <w:szCs w:val="20"/>
-          </w:rPr>
-          <w:t xml:space="preserve">Conclusion de [Nom 4]</w:t>
-        </w:r>
-        <w:r>
-          <w:rPr>
-            <w:b w:val="false"/>
-            <w:bCs w:val="false"/>
-            <w:sz w:val="20"/>
-            <w:szCs w:val="20"/>
-          </w:rPr>
-          <w:tab/>
-          <w:t xml:space="preserve">40</w:t>
+          <w:t xml:space="preserve">39</w:t>
         </w:r>
       </w:hyperlink>
     </w:p>
@@ -1579,7 +1549,7 @@
         <w:spacing w:after="20" w:before="140"/>
         <w:ind w:left="0"/>
       </w:pPr>
-      <w:hyperlink w:history="1" w:anchor="h42">
+      <w:hyperlink w:history="1" w:anchor="h41">
         <w:r>
           <w:rPr>
             <w:b/>
@@ -1597,7 +1567,7 @@
             <w:szCs w:val="22"/>
           </w:rPr>
           <w:tab/>
-          <w:t xml:space="preserve">41</w:t>
+          <w:t xml:space="preserve">40</w:t>
         </w:r>
       </w:hyperlink>
     </w:p>
@@ -1609,7 +1579,7 @@
         <w:spacing w:after="20" w:before="140"/>
         <w:ind w:left="0"/>
       </w:pPr>
-      <w:hyperlink w:history="1" w:anchor="h43">
+      <w:hyperlink w:history="1" w:anchor="h42">
         <w:r>
           <w:rPr>
             <w:b/>
@@ -1627,7 +1597,7 @@
             <w:szCs w:val="22"/>
           </w:rPr>
           <w:tab/>
-          <w:t xml:space="preserve">42</w:t>
+          <w:t xml:space="preserve">41</w:t>
         </w:r>
       </w:hyperlink>
     </w:p>
@@ -14757,7 +14727,7 @@
       </w:pPr>
       <w:bookmarkStart w:name="h38" w:id="39"/>
       <w:r>
-        <w:t xml:space="preserve">Conclusion de [Nom 1]</w:t>
+        <w:t xml:space="preserve">Conclusion de Vitaleme Celestin</w:t>
       </w:r>
       <w:bookmarkEnd w:id="39"/>
     </w:p>
@@ -14791,7 +14761,7 @@
       </w:pPr>
       <w:bookmarkStart w:name="h39" w:id="40"/>
       <w:r>
-        <w:t xml:space="preserve">Conclusion de [Nom 2]</w:t>
+        <w:t xml:space="preserve">Conclusion de Boris Rousseau Mbakam</w:t>
       </w:r>
       <w:bookmarkEnd w:id="40"/>
     </w:p>
@@ -14825,7 +14795,7 @@
       </w:pPr>
       <w:bookmarkStart w:name="h40" w:id="41"/>
       <w:r>
-        <w:t xml:space="preserve">Conclusion de [Nom 3]</w:t>
+        <w:t xml:space="preserve">Conclusion de Ricardo Martin Orbegoso Contreras</w:t>
       </w:r>
       <w:bookmarkEnd w:id="41"/>
     </w:p>
@@ -14855,13 +14825,198 @@
     </w:p>
     <w:p>
       <w:pPr>
-        <w:pStyle w:val="Heading2"/>
+        <w:pStyle w:val="Heading1"/>
+        <w:pageBreakBefore/>
       </w:pPr>
       <w:bookmarkStart w:name="h41" w:id="42"/>
       <w:r>
-        <w:t xml:space="preserve">Conclusion de [Nom 4]</w:t>
+        <w:t xml:space="preserve">10. Webographie</w:t>
       </w:r>
       <w:bookmarkEnd w:id="42"/>
+    </w:p>
+    <w:p>
+      <w:pPr>
+        <w:pStyle w:val="ListParagraph"/>
+        <w:numPr>
+          <w:ilvl w:val="0"/>
+          <w:numId w:val="2"/>
+        </w:numPr>
+        <w:spacing w:after="60"/>
+      </w:pPr>
+      <w:r>
+        <w:t xml:space="preserve">Proxmox VE — Documentation officielle . </w:t>
+      </w:r>
+      <w:r>
+        <w:rPr>
+          <w:color w:val="0563C1"/>
+          <w:u w:val="single"/>
+        </w:rPr>
+        <w:t xml:space="preserve">https://pve.proxmox.com/wiki/Main_Page</w:t>
+      </w:r>
+      <w:r>
+        <w:t xml:space="preserve"> (consulté le [date]).</w:t>
+      </w:r>
+    </w:p>
+    <w:p>
+      <w:pPr>
+        <w:pStyle w:val="ListParagraph"/>
+        <w:numPr>
+          <w:ilvl w:val="0"/>
+          <w:numId w:val="2"/>
+        </w:numPr>
+        <w:spacing w:after="60"/>
+      </w:pPr>
+      <w:r>
+        <w:t xml:space="preserve">Proxmox Backup Server — Documentation . </w:t>
+      </w:r>
+      <w:r>
+        <w:rPr>
+          <w:color w:val="0563C1"/>
+          <w:u w:val="single"/>
+        </w:rPr>
+        <w:t xml:space="preserve">https://pbs.proxmox.com/docs/</w:t>
+      </w:r>
+      <w:r>
+        <w:t xml:space="preserve"> (consulté le [date]).</w:t>
+      </w:r>
+    </w:p>
+    <w:p>
+      <w:pPr>
+        <w:pStyle w:val="ListParagraph"/>
+        <w:numPr>
+          <w:ilvl w:val="0"/>
+          <w:numId w:val="2"/>
+        </w:numPr>
+        <w:spacing w:after="60"/>
+      </w:pPr>
+      <w:r>
+        <w:t xml:space="preserve">Netgate — Documentation pfSense . </w:t>
+      </w:r>
+      <w:r>
+        <w:rPr>
+          <w:color w:val="0563C1"/>
+          <w:u w:val="single"/>
+        </w:rPr>
+        <w:t xml:space="preserve">https://docs.netgate.com/pfsense/en/latest/</w:t>
+      </w:r>
+      <w:r>
+        <w:t xml:space="preserve"> (consulté le [date]).</w:t>
+      </w:r>
+    </w:p>
+    <w:p>
+      <w:pPr>
+        <w:pStyle w:val="ListParagraph"/>
+        <w:numPr>
+          <w:ilvl w:val="0"/>
+          <w:numId w:val="2"/>
+        </w:numPr>
+        <w:spacing w:after="60"/>
+      </w:pPr>
+      <w:r>
+        <w:t xml:space="preserve">Microsoft Learn — Active Directory Domain Services . </w:t>
+      </w:r>
+      <w:r>
+        <w:rPr>
+          <w:color w:val="0563C1"/>
+          <w:u w:val="single"/>
+        </w:rPr>
+        <w:t xml:space="preserve">https://learn.microsoft.com/windows-server/identity/ad-ds/</w:t>
+      </w:r>
+      <w:r>
+        <w:t xml:space="preserve"> (consulté le [date]).</w:t>
+      </w:r>
+    </w:p>
+    <w:p>
+      <w:pPr>
+        <w:pStyle w:val="ListParagraph"/>
+        <w:numPr>
+          <w:ilvl w:val="0"/>
+          <w:numId w:val="2"/>
+        </w:numPr>
+        <w:spacing w:after="60"/>
+      </w:pPr>
+      <w:r>
+        <w:t xml:space="preserve">TrueNAS — Documentation . </w:t>
+      </w:r>
+      <w:r>
+        <w:rPr>
+          <w:color w:val="0563C1"/>
+          <w:u w:val="single"/>
+        </w:rPr>
+        <w:t xml:space="preserve">https://www.truenas.com/docs/</w:t>
+      </w:r>
+      <w:r>
+        <w:t xml:space="preserve"> (consulté le [date]).</w:t>
+      </w:r>
+    </w:p>
+    <w:p>
+      <w:pPr>
+        <w:pStyle w:val="ListParagraph"/>
+        <w:numPr>
+          <w:ilvl w:val="0"/>
+          <w:numId w:val="2"/>
+        </w:numPr>
+        <w:spacing w:after="60"/>
+      </w:pPr>
+      <w:r>
+        <w:t xml:space="preserve">Ansible — Documentation . </w:t>
+      </w:r>
+      <w:r>
+        <w:rPr>
+          <w:color w:val="0563C1"/>
+          <w:u w:val="single"/>
+        </w:rPr>
+        <w:t xml:space="preserve">https://docs.ansible.com/</w:t>
+      </w:r>
+      <w:r>
+        <w:t xml:space="preserve"> (consulté le [date]).</w:t>
+      </w:r>
+    </w:p>
+    <w:p>
+      <w:pPr>
+        <w:pStyle w:val="ListParagraph"/>
+        <w:numPr>
+          <w:ilvl w:val="0"/>
+          <w:numId w:val="2"/>
+        </w:numPr>
+        <w:spacing w:after="60"/>
+      </w:pPr>
+      <w:r>
+        <w:t xml:space="preserve">NextCloud — Documentation . </w:t>
+      </w:r>
+      <w:r>
+        <w:rPr>
+          <w:color w:val="0563C1"/>
+          <w:u w:val="single"/>
+        </w:rPr>
+        <w:t xml:space="preserve">https://docs.nextcloud.com/</w:t>
+      </w:r>
+      <w:r>
+        <w:t xml:space="preserve"> (consulté le [date]).</w:t>
+      </w:r>
+    </w:p>
+    <w:p>
+      <w:pPr>
+        <w:pStyle w:val="ListParagraph"/>
+        <w:numPr>
+          <w:ilvl w:val="0"/>
+          <w:numId w:val="2"/>
+        </w:numPr>
+        <w:spacing w:after="60"/>
+      </w:pPr>
+      <w:r>
+        <w:t xml:space="preserve">Linux Professional Institute — Learning . </w:t>
+      </w:r>
+      <w:r>
+        <w:rPr>
+          <w:color w:val="0563C1"/>
+          <w:u w:val="single"/>
+        </w:rPr>
+        <w:t xml:space="preserve">https://learning.lpi.org</w:t>
+      </w:r>
+      <w:r>
+        <w:t xml:space="preserve"> (consulté le [date]).</w:t>
+      </w:r>
     </w:p>
     <w:p>
       <w:pPr>
@@ -14884,7 +15039,7 @@
         <w:rPr>
           <w:color w:val="7F6000"/>
         </w:rPr>
-        <w:t xml:space="preserve">Conclusion personnelle (au moins un paragraphe, rédigée par le membre lui-même).</w:t>
+        <w:t xml:space="preserve">Ajoutez toutes les autres pages consultées pendant le projet.</w:t>
       </w:r>
     </w:p>
     <w:p>
@@ -14894,228 +15049,9 @@
       </w:pPr>
       <w:bookmarkStart w:name="h42" w:id="43"/>
       <w:r>
-        <w:t xml:space="preserve">10. Webographie</w:t>
+        <w:t xml:space="preserve">11. Annexe — Scripts utilisés</w:t>
       </w:r>
       <w:bookmarkEnd w:id="43"/>
-    </w:p>
-    <w:p>
-      <w:pPr>
-        <w:pStyle w:val="ListParagraph"/>
-        <w:numPr>
-          <w:ilvl w:val="0"/>
-          <w:numId w:val="2"/>
-        </w:numPr>
-        <w:spacing w:after="60"/>
-      </w:pPr>
-      <w:r>
-        <w:t xml:space="preserve">Proxmox VE — Documentation officielle . </w:t>
-      </w:r>
-      <w:r>
-        <w:rPr>
-          <w:color w:val="0563C1"/>
-          <w:u w:val="single"/>
-        </w:rPr>
-        <w:t xml:space="preserve">https://pve.proxmox.com/wiki/Main_Page</w:t>
-      </w:r>
-      <w:r>
-        <w:t xml:space="preserve"> (consulté le [date]).</w:t>
-      </w:r>
-    </w:p>
-    <w:p>
-      <w:pPr>
-        <w:pStyle w:val="ListParagraph"/>
-        <w:numPr>
-          <w:ilvl w:val="0"/>
-          <w:numId w:val="2"/>
-        </w:numPr>
-        <w:spacing w:after="60"/>
-      </w:pPr>
-      <w:r>
-        <w:t xml:space="preserve">Proxmox Backup Server — Documentation . </w:t>
-      </w:r>
-      <w:r>
-        <w:rPr>
-          <w:color w:val="0563C1"/>
-          <w:u w:val="single"/>
-        </w:rPr>
-        <w:t xml:space="preserve">https://pbs.proxmox.com/docs/</w:t>
-      </w:r>
-      <w:r>
-        <w:t xml:space="preserve"> (consulté le [date]).</w:t>
-      </w:r>
-    </w:p>
-    <w:p>
-      <w:pPr>
-        <w:pStyle w:val="ListParagraph"/>
-        <w:numPr>
-          <w:ilvl w:val="0"/>
-          <w:numId w:val="2"/>
-        </w:numPr>
-        <w:spacing w:after="60"/>
-      </w:pPr>
-      <w:r>
-        <w:t xml:space="preserve">Netgate — Documentation pfSense . </w:t>
-      </w:r>
-      <w:r>
-        <w:rPr>
-          <w:color w:val="0563C1"/>
-          <w:u w:val="single"/>
-        </w:rPr>
-        <w:t xml:space="preserve">https://docs.netgate.com/pfsense/en/latest/</w:t>
-      </w:r>
-      <w:r>
-        <w:t xml:space="preserve"> (consulté le [date]).</w:t>
-      </w:r>
-    </w:p>
-    <w:p>
-      <w:pPr>
-        <w:pStyle w:val="ListParagraph"/>
-        <w:numPr>
-          <w:ilvl w:val="0"/>
-          <w:numId w:val="2"/>
-        </w:numPr>
-        <w:spacing w:after="60"/>
-      </w:pPr>
-      <w:r>
-        <w:t xml:space="preserve">Microsoft Learn — Active Directory Domain Services . </w:t>
-      </w:r>
-      <w:r>
-        <w:rPr>
-          <w:color w:val="0563C1"/>
-          <w:u w:val="single"/>
-        </w:rPr>
-        <w:t xml:space="preserve">https://learn.microsoft.com/windows-server/identity/ad-ds/</w:t>
-      </w:r>
-      <w:r>
-        <w:t xml:space="preserve"> (consulté le [date]).</w:t>
-      </w:r>
-    </w:p>
-    <w:p>
-      <w:pPr>
-        <w:pStyle w:val="ListParagraph"/>
-        <w:numPr>
-          <w:ilvl w:val="0"/>
-          <w:numId w:val="2"/>
-        </w:numPr>
-        <w:spacing w:after="60"/>
-      </w:pPr>
-      <w:r>
-        <w:t xml:space="preserve">TrueNAS — Documentation . </w:t>
-      </w:r>
-      <w:r>
-        <w:rPr>
-          <w:color w:val="0563C1"/>
-          <w:u w:val="single"/>
-        </w:rPr>
-        <w:t xml:space="preserve">https://www.truenas.com/docs/</w:t>
-      </w:r>
-      <w:r>
-        <w:t xml:space="preserve"> (consulté le [date]).</w:t>
-      </w:r>
-    </w:p>
-    <w:p>
-      <w:pPr>
-        <w:pStyle w:val="ListParagraph"/>
-        <w:numPr>
-          <w:ilvl w:val="0"/>
-          <w:numId w:val="2"/>
-        </w:numPr>
-        <w:spacing w:after="60"/>
-      </w:pPr>
-      <w:r>
-        <w:t xml:space="preserve">Ansible — Documentation . </w:t>
-      </w:r>
-      <w:r>
-        <w:rPr>
-          <w:color w:val="0563C1"/>
-          <w:u w:val="single"/>
-        </w:rPr>
-        <w:t xml:space="preserve">https://docs.ansible.com/</w:t>
-      </w:r>
-      <w:r>
-        <w:t xml:space="preserve"> (consulté le [date]).</w:t>
-      </w:r>
-    </w:p>
-    <w:p>
-      <w:pPr>
-        <w:pStyle w:val="ListParagraph"/>
-        <w:numPr>
-          <w:ilvl w:val="0"/>
-          <w:numId w:val="2"/>
-        </w:numPr>
-        <w:spacing w:after="60"/>
-      </w:pPr>
-      <w:r>
-        <w:t xml:space="preserve">NextCloud — Documentation . </w:t>
-      </w:r>
-      <w:r>
-        <w:rPr>
-          <w:color w:val="0563C1"/>
-          <w:u w:val="single"/>
-        </w:rPr>
-        <w:t xml:space="preserve">https://docs.nextcloud.com/</w:t>
-      </w:r>
-      <w:r>
-        <w:t xml:space="preserve"> (consulté le [date]).</w:t>
-      </w:r>
-    </w:p>
-    <w:p>
-      <w:pPr>
-        <w:pStyle w:val="ListParagraph"/>
-        <w:numPr>
-          <w:ilvl w:val="0"/>
-          <w:numId w:val="2"/>
-        </w:numPr>
-        <w:spacing w:after="60"/>
-      </w:pPr>
-      <w:r>
-        <w:t xml:space="preserve">Linux Professional Institute — Learning . </w:t>
-      </w:r>
-      <w:r>
-        <w:rPr>
-          <w:color w:val="0563C1"/>
-          <w:u w:val="single"/>
-        </w:rPr>
-        <w:t xml:space="preserve">https://learning.lpi.org</w:t>
-      </w:r>
-      <w:r>
-        <w:t xml:space="preserve"> (consulté le [date]).</w:t>
-      </w:r>
-    </w:p>
-    <w:p>
-      <w:pPr>
-        <w:pBdr>
-          <w:left w:val="single" w:color="BF9000" w:sz="18" w:space="6"/>
-        </w:pBdr>
-        <w:shd w:fill="FFF4CE" w:color="auto" w:val="clear"/>
-        <w:spacing w:after="160" w:before="60"/>
-        <w:ind w:left="120"/>
-      </w:pPr>
-      <w:r>
-        <w:rPr>
-          <w:b/>
-          <w:bCs/>
-          <w:color w:val="7F6000"/>
-        </w:rPr>
-        <w:t xml:space="preserve">[À compléter] </w:t>
-      </w:r>
-      <w:r>
-        <w:rPr>
-          <w:color w:val="7F6000"/>
-        </w:rPr>
-        <w:t xml:space="preserve">Ajoutez toutes les autres pages consultées pendant le projet.</w:t>
-      </w:r>
-    </w:p>
-    <w:p>
-      <w:pPr>
-        <w:pStyle w:val="Heading1"/>
-        <w:pageBreakBefore/>
-      </w:pPr>
-      <w:bookmarkStart w:name="h43" w:id="44"/>
-      <w:r>
-        <w:t xml:space="preserve">11. Annexe — Scripts utilisés</w:t>
-      </w:r>
-      <w:bookmarkEnd w:id="44"/>
     </w:p>
     <w:p>
       <w:pPr>

</xml_diff>